<commit_message>
Parse data from text file
</commit_message>
<xml_diff>
--- a/Template - SHORT - Individual.docx
+++ b/Template - SHORT - Individual.docx
@@ -140,6 +140,7 @@
           <w:rFonts w:ascii="Times New Roman" w:hAnsi="Times New Roman" w:cs="Times New Roman"/>
           <w:bCs/>
           <w:iCs/>
+          <w:highlight w:val="yellow"/>
         </w:rPr>
       </w:pPr>
       <w:r>
@@ -147,6 +148,7 @@
           <w:rFonts w:ascii="Times New Roman" w:hAnsi="Times New Roman" w:cs="Times New Roman"/>
           <w:bCs/>
           <w:iCs/>
+          <w:highlight w:val="yellow"/>
         </w:rPr>
         <w:t>INSURANCE_NAME</w:t>
       </w:r>
@@ -155,6 +157,7 @@
           <w:rFonts w:ascii="Times New Roman" w:hAnsi="Times New Roman" w:cs="Times New Roman"/>
           <w:bCs/>
           <w:iCs/>
+          <w:highlight w:val="yellow"/>
         </w:rPr>
         <w:t xml:space="preserve"> </w:t>
       </w:r>
@@ -169,6 +172,7 @@
           <w:rFonts w:ascii="Times New Roman" w:hAnsi="Times New Roman" w:cs="Times New Roman"/>
           <w:bCs/>
           <w:iCs/>
+          <w:highlight w:val="yellow"/>
         </w:rPr>
       </w:pPr>
       <w:r>
@@ -176,6 +180,7 @@
           <w:rFonts w:ascii="Times New Roman" w:hAnsi="Times New Roman" w:cs="Times New Roman"/>
           <w:bCs/>
           <w:iCs/>
+          <w:highlight w:val="yellow"/>
         </w:rPr>
         <w:t xml:space="preserve">Attn: </w:t>
       </w:r>
@@ -184,6 +189,7 @@
           <w:rFonts w:ascii="Times New Roman" w:hAnsi="Times New Roman" w:cs="Times New Roman"/>
           <w:bCs/>
           <w:iCs/>
+          <w:highlight w:val="yellow"/>
         </w:rPr>
         <w:t>CLAIM_RESPONSIBLE_RECEIVER</w:t>
       </w:r>
@@ -198,6 +204,7 @@
           <w:rFonts w:ascii="Times New Roman" w:hAnsi="Times New Roman" w:cs="Times New Roman"/>
           <w:bCs/>
           <w:iCs/>
+          <w:highlight w:val="yellow"/>
         </w:rPr>
       </w:pPr>
       <w:r>
@@ -205,6 +212,7 @@
           <w:rFonts w:ascii="Times New Roman" w:hAnsi="Times New Roman" w:cs="Times New Roman"/>
           <w:bCs/>
           <w:iCs/>
+          <w:highlight w:val="yellow"/>
         </w:rPr>
         <w:t>Claims Department</w:t>
       </w:r>
@@ -270,12 +278,22 @@
           <w:b/>
           <w:u w:val="single"/>
         </w:rPr>
-        <w:t xml:space="preserve">POLICY LIMIT SETTLEMENT DEMAND OFFER; EXPIRES AT 5:00 P.M. ON </w:t>
-      </w:r>
-      <w:r>
-        <w:rPr>
-          <w:rFonts w:ascii="Times New Roman" w:hAnsi="Times New Roman" w:cs="Times New Roman"/>
-          <w:b/>
+        <w:t xml:space="preserve">POLICY LIMIT SETTLEMENT DEMAND OFFER; EXPIRES AT 5:00 P.M. </w:t>
+      </w:r>
+      <w:r>
+        <w:rPr>
+          <w:rFonts w:ascii="Times New Roman" w:hAnsi="Times New Roman" w:cs="Times New Roman"/>
+          <w:b/>
+          <w:highlight w:val="yellow"/>
+          <w:u w:val="single"/>
+        </w:rPr>
+        <w:t xml:space="preserve">ON </w:t>
+      </w:r>
+      <w:r>
+        <w:rPr>
+          <w:rFonts w:ascii="Times New Roman" w:hAnsi="Times New Roman" w:cs="Times New Roman"/>
+          <w:b/>
+          <w:highlight w:val="yellow"/>
           <w:u w:val="single"/>
         </w:rPr>
         <w:t>SETTLEMENT_EXP_DATE</w:t>
@@ -351,6 +369,7 @@
           <w:b/>
           <w:bCs/>
           <w:iCs/>
+          <w:highlight w:val="yellow"/>
         </w:rPr>
         <w:t>CLIENT_NAME_ALL_CAP</w:t>
       </w:r>
@@ -612,6 +631,7 @@
           <w:rFonts w:ascii="Times New Roman" w:hAnsi="Times New Roman" w:cs="Times New Roman"/>
           <w:bCs/>
           <w:iCs/>
+          <w:highlight w:val="yellow"/>
         </w:rPr>
         <w:t>CLAIM_RESPONSIBLE_RECEIVER</w:t>
       </w:r>
@@ -636,6 +656,7 @@
           <w:rFonts w:ascii="Times New Roman" w:hAnsi="Times New Roman" w:cs="Times New Roman"/>
           <w:bCs/>
           <w:iCs/>
+          <w:highlight w:val="yellow"/>
         </w:rPr>
         <w:t>INSURANCE_NAME</w:t>
       </w:r>
@@ -703,6 +724,7 @@
           <w:rFonts w:ascii="Times New Roman" w:hAnsi="Times New Roman" w:cs="Times New Roman"/>
           <w:bCs/>
           <w:iCs/>
+          <w:highlight w:val="yellow"/>
         </w:rPr>
         <w:t>CLIENT_NAME_EACH_CAP</w:t>
       </w:r>
@@ -719,6 +741,7 @@
           <w:rFonts w:ascii="Times New Roman" w:hAnsi="Times New Roman" w:cs="Times New Roman"/>
           <w:bCs/>
           <w:iCs/>
+          <w:highlight w:val="yellow"/>
         </w:rPr>
         <w:t>DATE_OF_LOSS_FORMATTED</w:t>
       </w:r>
@@ -745,15 +768,16 @@
           <w:bCs/>
           <w:iCs/>
         </w:rPr>
-        <w:t xml:space="preserve"> Code §§ 1152, 1154, as well as any other applicable privileges. Attached please find a</w:t>
+        <w:t xml:space="preserve"> Code §§ 1152, 1154, as well as any other applicable privileges. Attached please </w:t>
       </w:r>
       <w:r>
         <w:rPr>
           <w:rFonts w:ascii="Times New Roman" w:hAnsi="Times New Roman" w:cs="Times New Roman"/>
           <w:bCs/>
           <w:iCs/>
-        </w:rPr>
-        <w:t xml:space="preserve">ttachments </w:t>
+          <w:highlight w:val="yellow"/>
+        </w:rPr>
+        <w:t>find a</w:t>
       </w:r>
       <w:r>
         <w:rPr>
@@ -761,13 +785,22 @@
           <w:bCs/>
           <w:iCs/>
         </w:rPr>
-        <w:t xml:space="preserve">with my client’s medical reports, medical billing statements, and property damage photos of damage to my client’s vehicle, which reflect the injuries and damages </w:t>
+        <w:t xml:space="preserve">ttachments </w:t>
       </w:r>
       <w:r>
         <w:rPr>
           <w:rFonts w:ascii="Times New Roman" w:hAnsi="Times New Roman" w:cs="Times New Roman"/>
           <w:bCs/>
           <w:iCs/>
+        </w:rPr>
+        <w:t xml:space="preserve">with my client’s medical reports, medical billing statements, and property damage photos of damage to my client’s vehicle, which reflect the injuries and damages </w:t>
+      </w:r>
+      <w:r>
+        <w:rPr>
+          <w:rFonts w:ascii="Times New Roman" w:hAnsi="Times New Roman" w:cs="Times New Roman"/>
+          <w:bCs/>
+          <w:iCs/>
+          <w:highlight w:val="yellow"/>
         </w:rPr>
         <w:t>HE_SHE_CLIENT</w:t>
       </w:r>
@@ -1552,6 +1585,186 @@
         </w:rPr>
         <w:t>· L4-L5 disc bulge.</w:t>
       </w:r>
+    </w:p>
+    <w:p>
+      <w:pPr>
+        <w:pStyle w:val="ListParagraph"/>
+        <w:numPr>
+          <w:ilvl w:val="0"/>
+          <w:numId w:val="29"/>
+        </w:numPr>
+        <w:jc w:val="both"/>
+        <w:rPr>
+          <w:rFonts w:ascii="Times New Roman" w:eastAsia="Calibri" w:hAnsi="Times New Roman" w:cs="Times New Roman"/>
+          <w:highlight w:val="yellow"/>
+        </w:rPr>
+      </w:pPr>
+      <w:r>
+        <w:rPr>
+          <w:rFonts w:ascii="Times New Roman" w:eastAsia="Calibri" w:hAnsi="Times New Roman" w:cs="Times New Roman"/>
+          <w:highlight w:val="yellow"/>
+        </w:rPr>
+        <w:t xml:space="preserve">· L5-S1 disc bulge. </w:t>
+      </w:r>
+      <w:r>
+        <w:rPr>
+          <w:rFonts w:ascii="Times New Roman" w:eastAsia="Calibri" w:hAnsi="Times New Roman" w:cs="Times New Roman"/>
+          <w:highlight w:val="yellow"/>
+        </w:rPr>
+        <w:tab/>
+      </w:r>
+      <w:r>
+        <w:rPr>
+          <w:rFonts w:ascii="Times New Roman" w:eastAsia="Calibri" w:hAnsi="Times New Roman" w:cs="Times New Roman"/>
+          <w:highlight w:val="yellow"/>
+        </w:rPr>
+        <w:tab/>
+      </w:r>
+    </w:p>
+    <w:p>
+      <w:pPr>
+        <w:pStyle w:val="ListParagraph"/>
+        <w:numPr>
+          <w:ilvl w:val="0"/>
+          <w:numId w:val="29"/>
+        </w:numPr>
+        <w:jc w:val="both"/>
+        <w:rPr>
+          <w:rFonts w:ascii="Times New Roman" w:eastAsia="Calibri" w:hAnsi="Times New Roman" w:cs="Times New Roman"/>
+          <w:highlight w:val="yellow"/>
+        </w:rPr>
+      </w:pPr>
+      <w:r>
+        <w:rPr>
+          <w:rFonts w:ascii="Times New Roman" w:eastAsia="Calibri" w:hAnsi="Times New Roman" w:cs="Times New Roman"/>
+          <w:highlight w:val="yellow"/>
+        </w:rPr>
+        <w:t xml:space="preserve">· Lower Back Pain </w:t>
+      </w:r>
+    </w:p>
+    <w:p>
+      <w:pPr>
+        <w:pStyle w:val="ListParagraph"/>
+        <w:numPr>
+          <w:ilvl w:val="0"/>
+          <w:numId w:val="29"/>
+        </w:numPr>
+        <w:jc w:val="both"/>
+        <w:rPr>
+          <w:rFonts w:ascii="Times New Roman" w:eastAsia="Calibri" w:hAnsi="Times New Roman" w:cs="Times New Roman"/>
+          <w:highlight w:val="yellow"/>
+        </w:rPr>
+      </w:pPr>
+      <w:r>
+        <w:rPr>
+          <w:rFonts w:ascii="Times New Roman" w:eastAsia="Calibri" w:hAnsi="Times New Roman" w:cs="Times New Roman"/>
+          <w:highlight w:val="yellow"/>
+        </w:rPr>
+        <w:t xml:space="preserve">· Lumbar Radiculopathy </w:t>
+      </w:r>
+      <w:r>
+        <w:rPr>
+          <w:rFonts w:ascii="Times New Roman" w:eastAsia="Calibri" w:hAnsi="Times New Roman" w:cs="Times New Roman"/>
+          <w:highlight w:val="yellow"/>
+        </w:rPr>
+        <w:tab/>
+      </w:r>
+      <w:r>
+        <w:rPr>
+          <w:rFonts w:ascii="Times New Roman" w:eastAsia="Calibri" w:hAnsi="Times New Roman" w:cs="Times New Roman"/>
+          <w:highlight w:val="yellow"/>
+        </w:rPr>
+        <w:tab/>
+      </w:r>
+      <w:r>
+        <w:rPr>
+          <w:rFonts w:ascii="Times New Roman" w:eastAsia="Calibri" w:hAnsi="Times New Roman" w:cs="Times New Roman"/>
+          <w:highlight w:val="yellow"/>
+        </w:rPr>
+        <w:tab/>
+      </w:r>
+    </w:p>
+    <w:p>
+      <w:pPr>
+        <w:pStyle w:val="ListParagraph"/>
+        <w:numPr>
+          <w:ilvl w:val="0"/>
+          <w:numId w:val="29"/>
+        </w:numPr>
+        <w:jc w:val="both"/>
+        <w:rPr>
+          <w:rFonts w:ascii="Times New Roman" w:eastAsia="Calibri" w:hAnsi="Times New Roman" w:cs="Times New Roman"/>
+          <w:highlight w:val="yellow"/>
+        </w:rPr>
+      </w:pPr>
+      <w:r>
+        <w:rPr>
+          <w:rFonts w:ascii="Times New Roman" w:eastAsia="Calibri" w:hAnsi="Times New Roman" w:cs="Times New Roman"/>
+          <w:highlight w:val="yellow"/>
+        </w:rPr>
+        <w:t xml:space="preserve">· Lumbar Spondylosis </w:t>
+      </w:r>
+      <w:r>
+        <w:rPr>
+          <w:rFonts w:ascii="Times New Roman" w:eastAsia="Calibri" w:hAnsi="Times New Roman" w:cs="Times New Roman"/>
+          <w:highlight w:val="yellow"/>
+        </w:rPr>
+        <w:tab/>
+      </w:r>
+      <w:r>
+        <w:rPr>
+          <w:rFonts w:ascii="Times New Roman" w:eastAsia="Calibri" w:hAnsi="Times New Roman" w:cs="Times New Roman"/>
+          <w:highlight w:val="yellow"/>
+        </w:rPr>
+        <w:tab/>
+      </w:r>
+      <w:r>
+        <w:rPr>
+          <w:rFonts w:ascii="Times New Roman" w:eastAsia="Calibri" w:hAnsi="Times New Roman" w:cs="Times New Roman"/>
+          <w:highlight w:val="yellow"/>
+        </w:rPr>
+        <w:tab/>
+        <w:t xml:space="preserve"> </w:t>
+      </w:r>
+    </w:p>
+    <w:p>
+      <w:pPr>
+        <w:pStyle w:val="ListParagraph"/>
+        <w:numPr>
+          <w:ilvl w:val="0"/>
+          <w:numId w:val="29"/>
+        </w:numPr>
+        <w:jc w:val="both"/>
+        <w:rPr>
+          <w:rFonts w:ascii="Times New Roman" w:eastAsia="Calibri" w:hAnsi="Times New Roman" w:cs="Times New Roman"/>
+          <w:highlight w:val="yellow"/>
+        </w:rPr>
+      </w:pPr>
+      <w:r>
+        <w:rPr>
+          <w:rFonts w:ascii="Times New Roman" w:eastAsia="Calibri" w:hAnsi="Times New Roman" w:cs="Times New Roman"/>
+          <w:highlight w:val="yellow"/>
+        </w:rPr>
+        <w:t>· Myositis</w:t>
+      </w:r>
+      <w:r>
+        <w:rPr>
+          <w:rFonts w:ascii="Times New Roman" w:eastAsia="Calibri" w:hAnsi="Times New Roman" w:cs="Times New Roman"/>
+        </w:rPr>
+        <w:t xml:space="preserve"> </w:t>
+      </w:r>
+      <w:r>
+        <w:rPr>
+          <w:rFonts w:ascii="Times New Roman" w:eastAsia="Calibri" w:hAnsi="Times New Roman" w:cs="Times New Roman"/>
+        </w:rPr>
+        <w:tab/>
+      </w:r>
+      <w:r>
+        <w:rPr>
+          <w:rFonts w:ascii="Times New Roman" w:eastAsia="Calibri" w:hAnsi="Times New Roman" w:cs="Times New Roman"/>
+        </w:rPr>
+        <w:t xml:space="preserve">      </w:t>
+      </w:r>
       <w:r>
         <w:rPr>
           <w:rFonts w:ascii="Times New Roman" w:eastAsia="Calibri" w:hAnsi="Times New Roman" w:cs="Times New Roman"/>
@@ -1832,6 +2045,213 @@
     </w:p>
     <w:p>
       <w:pPr>
+        <w:pStyle w:val="ListParagraph"/>
+        <w:numPr>
+          <w:ilvl w:val="0"/>
+          <w:numId w:val="30"/>
+        </w:numPr>
+        <w:jc w:val="both"/>
+        <w:rPr>
+          <w:rFonts w:ascii="Times New Roman" w:eastAsia="Calibri" w:hAnsi="Times New Roman" w:cs="Times New Roman"/>
+        </w:rPr>
+      </w:pPr>
+      <w:r>
+        <w:rPr>
+          <w:rFonts w:ascii="Times New Roman" w:eastAsia="Calibri" w:hAnsi="Times New Roman" w:cs="Times New Roman"/>
+        </w:rPr>
+        <w:t xml:space="preserve">· MRI of Lumbar Spine </w:t>
+      </w:r>
+    </w:p>
+    <w:p>
+      <w:pPr>
+        <w:pStyle w:val="ListParagraph"/>
+        <w:numPr>
+          <w:ilvl w:val="0"/>
+          <w:numId w:val="30"/>
+        </w:numPr>
+        <w:jc w:val="both"/>
+        <w:rPr>
+          <w:rFonts w:ascii="Times New Roman" w:eastAsia="Calibri" w:hAnsi="Times New Roman" w:cs="Times New Roman"/>
+          <w:highlight w:val="yellow"/>
+        </w:rPr>
+      </w:pPr>
+      <w:r>
+        <w:rPr>
+          <w:rFonts w:ascii="Times New Roman" w:eastAsia="Calibri" w:hAnsi="Times New Roman" w:cs="Times New Roman"/>
+          <w:highlight w:val="yellow"/>
+        </w:rPr>
+        <w:t>· L4-L5 disc bulge.</w:t>
+      </w:r>
+    </w:p>
+    <w:p>
+      <w:pPr>
+        <w:pStyle w:val="ListParagraph"/>
+        <w:numPr>
+          <w:ilvl w:val="0"/>
+          <w:numId w:val="30"/>
+        </w:numPr>
+        <w:jc w:val="both"/>
+        <w:rPr>
+          <w:rFonts w:ascii="Times New Roman" w:eastAsia="Calibri" w:hAnsi="Times New Roman" w:cs="Times New Roman"/>
+          <w:highlight w:val="yellow"/>
+        </w:rPr>
+      </w:pPr>
+      <w:r>
+        <w:rPr>
+          <w:rFonts w:ascii="Times New Roman" w:eastAsia="Calibri" w:hAnsi="Times New Roman" w:cs="Times New Roman"/>
+          <w:highlight w:val="yellow"/>
+        </w:rPr>
+        <w:t xml:space="preserve">· L5-S1 disc bulge. </w:t>
+      </w:r>
+      <w:r>
+        <w:rPr>
+          <w:rFonts w:ascii="Times New Roman" w:eastAsia="Calibri" w:hAnsi="Times New Roman" w:cs="Times New Roman"/>
+          <w:highlight w:val="yellow"/>
+        </w:rPr>
+        <w:tab/>
+      </w:r>
+      <w:r>
+        <w:rPr>
+          <w:rFonts w:ascii="Times New Roman" w:eastAsia="Calibri" w:hAnsi="Times New Roman" w:cs="Times New Roman"/>
+          <w:highlight w:val="yellow"/>
+        </w:rPr>
+        <w:tab/>
+      </w:r>
+    </w:p>
+    <w:p>
+      <w:pPr>
+        <w:pStyle w:val="ListParagraph"/>
+        <w:numPr>
+          <w:ilvl w:val="0"/>
+          <w:numId w:val="30"/>
+        </w:numPr>
+        <w:jc w:val="both"/>
+        <w:rPr>
+          <w:rFonts w:ascii="Times New Roman" w:eastAsia="Calibri" w:hAnsi="Times New Roman" w:cs="Times New Roman"/>
+          <w:highlight w:val="yellow"/>
+        </w:rPr>
+      </w:pPr>
+      <w:r>
+        <w:rPr>
+          <w:rFonts w:ascii="Times New Roman" w:eastAsia="Calibri" w:hAnsi="Times New Roman" w:cs="Times New Roman"/>
+          <w:highlight w:val="yellow"/>
+        </w:rPr>
+        <w:t xml:space="preserve">· Lower Back Pain </w:t>
+      </w:r>
+    </w:p>
+    <w:p>
+      <w:pPr>
+        <w:pStyle w:val="ListParagraph"/>
+        <w:numPr>
+          <w:ilvl w:val="0"/>
+          <w:numId w:val="30"/>
+        </w:numPr>
+        <w:jc w:val="both"/>
+        <w:rPr>
+          <w:rFonts w:ascii="Times New Roman" w:eastAsia="Calibri" w:hAnsi="Times New Roman" w:cs="Times New Roman"/>
+          <w:highlight w:val="yellow"/>
+        </w:rPr>
+      </w:pPr>
+      <w:r>
+        <w:rPr>
+          <w:rFonts w:ascii="Times New Roman" w:eastAsia="Calibri" w:hAnsi="Times New Roman" w:cs="Times New Roman"/>
+          <w:highlight w:val="yellow"/>
+        </w:rPr>
+        <w:t xml:space="preserve">· Lumbar Radiculopathy </w:t>
+      </w:r>
+      <w:r>
+        <w:rPr>
+          <w:rFonts w:ascii="Times New Roman" w:eastAsia="Calibri" w:hAnsi="Times New Roman" w:cs="Times New Roman"/>
+          <w:highlight w:val="yellow"/>
+        </w:rPr>
+        <w:tab/>
+      </w:r>
+      <w:r>
+        <w:rPr>
+          <w:rFonts w:ascii="Times New Roman" w:eastAsia="Calibri" w:hAnsi="Times New Roman" w:cs="Times New Roman"/>
+          <w:highlight w:val="yellow"/>
+        </w:rPr>
+        <w:tab/>
+      </w:r>
+      <w:r>
+        <w:rPr>
+          <w:rFonts w:ascii="Times New Roman" w:eastAsia="Calibri" w:hAnsi="Times New Roman" w:cs="Times New Roman"/>
+          <w:highlight w:val="yellow"/>
+        </w:rPr>
+        <w:tab/>
+      </w:r>
+    </w:p>
+    <w:p>
+      <w:pPr>
+        <w:pStyle w:val="ListParagraph"/>
+        <w:numPr>
+          <w:ilvl w:val="0"/>
+          <w:numId w:val="30"/>
+        </w:numPr>
+        <w:jc w:val="both"/>
+        <w:rPr>
+          <w:rFonts w:ascii="Times New Roman" w:eastAsia="Calibri" w:hAnsi="Times New Roman" w:cs="Times New Roman"/>
+          <w:highlight w:val="yellow"/>
+        </w:rPr>
+      </w:pPr>
+      <w:r>
+        <w:rPr>
+          <w:rFonts w:ascii="Times New Roman" w:eastAsia="Calibri" w:hAnsi="Times New Roman" w:cs="Times New Roman"/>
+          <w:highlight w:val="yellow"/>
+        </w:rPr>
+        <w:t xml:space="preserve">· Lumbar Spondylosis </w:t>
+      </w:r>
+      <w:r>
+        <w:rPr>
+          <w:rFonts w:ascii="Times New Roman" w:eastAsia="Calibri" w:hAnsi="Times New Roman" w:cs="Times New Roman"/>
+          <w:highlight w:val="yellow"/>
+        </w:rPr>
+        <w:tab/>
+      </w:r>
+      <w:r>
+        <w:rPr>
+          <w:rFonts w:ascii="Times New Roman" w:eastAsia="Calibri" w:hAnsi="Times New Roman" w:cs="Times New Roman"/>
+          <w:highlight w:val="yellow"/>
+        </w:rPr>
+        <w:tab/>
+      </w:r>
+      <w:r>
+        <w:rPr>
+          <w:rFonts w:ascii="Times New Roman" w:eastAsia="Calibri" w:hAnsi="Times New Roman" w:cs="Times New Roman"/>
+          <w:highlight w:val="yellow"/>
+        </w:rPr>
+        <w:tab/>
+        <w:t xml:space="preserve"> </w:t>
+      </w:r>
+    </w:p>
+    <w:p>
+      <w:pPr>
+        <w:pStyle w:val="ListParagraph"/>
+        <w:numPr>
+          <w:ilvl w:val="0"/>
+          <w:numId w:val="30"/>
+        </w:numPr>
+        <w:jc w:val="both"/>
+        <w:rPr>
+          <w:rFonts w:ascii="Times New Roman" w:eastAsia="Calibri" w:hAnsi="Times New Roman" w:cs="Times New Roman"/>
+        </w:rPr>
+      </w:pPr>
+      <w:r>
+        <w:rPr>
+          <w:rFonts w:ascii="Times New Roman" w:eastAsia="Calibri" w:hAnsi="Times New Roman" w:cs="Times New Roman"/>
+          <w:highlight w:val="yellow"/>
+        </w:rPr>
+        <w:t>· Myositis</w:t>
+      </w:r>
+      <w:r>
+        <w:rPr>
+          <w:rFonts w:ascii="Times New Roman" w:eastAsia="Calibri" w:hAnsi="Times New Roman" w:cs="Times New Roman"/>
+        </w:rPr>
+        <w:tab/>
+      </w:r>
+    </w:p>
+    <w:p>
+      <w:pPr>
         <w:ind w:left="720"/>
         <w:jc w:val="both"/>
         <w:rPr>
@@ -2043,6 +2463,429 @@
     </w:p>
     <w:p>
       <w:pPr>
+        <w:pStyle w:val="ListParagraph"/>
+        <w:numPr>
+          <w:ilvl w:val="0"/>
+          <w:numId w:val="31"/>
+        </w:numPr>
+        <w:jc w:val="both"/>
+        <w:rPr>
+          <w:rFonts w:ascii="Times New Roman" w:eastAsia="Calibri" w:hAnsi="Times New Roman" w:cs="Times New Roman"/>
+        </w:rPr>
+      </w:pPr>
+      <w:r>
+        <w:rPr>
+          <w:rFonts w:ascii="Times New Roman" w:eastAsia="Calibri" w:hAnsi="Times New Roman" w:cs="Times New Roman"/>
+          <w:highlight w:val="yellow"/>
+        </w:rPr>
+        <w:t>· Myositis</w:t>
+      </w:r>
+    </w:p>
+    <w:p>
+      <w:pPr>
+        <w:pStyle w:val="ListParagraph"/>
+        <w:numPr>
+          <w:ilvl w:val="0"/>
+          <w:numId w:val="31"/>
+        </w:numPr>
+        <w:jc w:val="both"/>
+        <w:rPr>
+          <w:rFonts w:ascii="Times New Roman" w:eastAsia="Calibri" w:hAnsi="Times New Roman" w:cs="Times New Roman"/>
+        </w:rPr>
+      </w:pPr>
+      <w:r>
+        <w:rPr>
+          <w:rFonts w:ascii="Times New Roman" w:eastAsia="Calibri" w:hAnsi="Times New Roman" w:cs="Times New Roman"/>
+        </w:rPr>
+        <w:t xml:space="preserve">· MRI of Lumbar Spine </w:t>
+      </w:r>
+    </w:p>
+    <w:p>
+      <w:pPr>
+        <w:pStyle w:val="ListParagraph"/>
+        <w:numPr>
+          <w:ilvl w:val="0"/>
+          <w:numId w:val="31"/>
+        </w:numPr>
+        <w:jc w:val="both"/>
+        <w:rPr>
+          <w:rFonts w:ascii="Times New Roman" w:eastAsia="Calibri" w:hAnsi="Times New Roman" w:cs="Times New Roman"/>
+          <w:highlight w:val="yellow"/>
+        </w:rPr>
+      </w:pPr>
+      <w:r>
+        <w:rPr>
+          <w:rFonts w:ascii="Times New Roman" w:eastAsia="Calibri" w:hAnsi="Times New Roman" w:cs="Times New Roman"/>
+          <w:highlight w:val="yellow"/>
+        </w:rPr>
+        <w:t>· L4-L5 disc bulge.</w:t>
+      </w:r>
+    </w:p>
+    <w:p>
+      <w:pPr>
+        <w:pStyle w:val="ListParagraph"/>
+        <w:numPr>
+          <w:ilvl w:val="0"/>
+          <w:numId w:val="31"/>
+        </w:numPr>
+        <w:jc w:val="both"/>
+        <w:rPr>
+          <w:rFonts w:ascii="Times New Roman" w:eastAsia="Calibri" w:hAnsi="Times New Roman" w:cs="Times New Roman"/>
+          <w:highlight w:val="yellow"/>
+        </w:rPr>
+      </w:pPr>
+      <w:r>
+        <w:rPr>
+          <w:rFonts w:ascii="Times New Roman" w:eastAsia="Calibri" w:hAnsi="Times New Roman" w:cs="Times New Roman"/>
+          <w:highlight w:val="yellow"/>
+        </w:rPr>
+        <w:t xml:space="preserve">· L5-S1 disc bulge. </w:t>
+      </w:r>
+      <w:r>
+        <w:rPr>
+          <w:rFonts w:ascii="Times New Roman" w:eastAsia="Calibri" w:hAnsi="Times New Roman" w:cs="Times New Roman"/>
+          <w:highlight w:val="yellow"/>
+        </w:rPr>
+        <w:tab/>
+      </w:r>
+      <w:r>
+        <w:rPr>
+          <w:rFonts w:ascii="Times New Roman" w:eastAsia="Calibri" w:hAnsi="Times New Roman" w:cs="Times New Roman"/>
+          <w:highlight w:val="yellow"/>
+        </w:rPr>
+        <w:tab/>
+      </w:r>
+    </w:p>
+    <w:p>
+      <w:pPr>
+        <w:pStyle w:val="ListParagraph"/>
+        <w:numPr>
+          <w:ilvl w:val="0"/>
+          <w:numId w:val="31"/>
+        </w:numPr>
+        <w:jc w:val="both"/>
+        <w:rPr>
+          <w:rFonts w:ascii="Times New Roman" w:eastAsia="Calibri" w:hAnsi="Times New Roman" w:cs="Times New Roman"/>
+          <w:highlight w:val="yellow"/>
+        </w:rPr>
+      </w:pPr>
+      <w:r>
+        <w:rPr>
+          <w:rFonts w:ascii="Times New Roman" w:eastAsia="Calibri" w:hAnsi="Times New Roman" w:cs="Times New Roman"/>
+          <w:highlight w:val="yellow"/>
+        </w:rPr>
+        <w:t xml:space="preserve">· Lower Back Pain </w:t>
+      </w:r>
+    </w:p>
+    <w:p>
+      <w:pPr>
+        <w:pStyle w:val="ListParagraph"/>
+        <w:numPr>
+          <w:ilvl w:val="0"/>
+          <w:numId w:val="31"/>
+        </w:numPr>
+        <w:jc w:val="both"/>
+        <w:rPr>
+          <w:rFonts w:ascii="Times New Roman" w:eastAsia="Calibri" w:hAnsi="Times New Roman" w:cs="Times New Roman"/>
+          <w:highlight w:val="yellow"/>
+        </w:rPr>
+      </w:pPr>
+      <w:r>
+        <w:rPr>
+          <w:rFonts w:ascii="Times New Roman" w:eastAsia="Calibri" w:hAnsi="Times New Roman" w:cs="Times New Roman"/>
+          <w:highlight w:val="yellow"/>
+        </w:rPr>
+        <w:t xml:space="preserve">· Lumbar Radiculopathy </w:t>
+      </w:r>
+      <w:r>
+        <w:rPr>
+          <w:rFonts w:ascii="Times New Roman" w:eastAsia="Calibri" w:hAnsi="Times New Roman" w:cs="Times New Roman"/>
+          <w:highlight w:val="yellow"/>
+        </w:rPr>
+        <w:tab/>
+      </w:r>
+      <w:r>
+        <w:rPr>
+          <w:rFonts w:ascii="Times New Roman" w:eastAsia="Calibri" w:hAnsi="Times New Roman" w:cs="Times New Roman"/>
+          <w:highlight w:val="yellow"/>
+        </w:rPr>
+        <w:tab/>
+      </w:r>
+      <w:r>
+        <w:rPr>
+          <w:rFonts w:ascii="Times New Roman" w:eastAsia="Calibri" w:hAnsi="Times New Roman" w:cs="Times New Roman"/>
+          <w:highlight w:val="yellow"/>
+        </w:rPr>
+        <w:tab/>
+      </w:r>
+    </w:p>
+    <w:p>
+      <w:pPr>
+        <w:pStyle w:val="ListParagraph"/>
+        <w:numPr>
+          <w:ilvl w:val="0"/>
+          <w:numId w:val="31"/>
+        </w:numPr>
+        <w:jc w:val="both"/>
+        <w:rPr>
+          <w:rFonts w:ascii="Times New Roman" w:eastAsia="Calibri" w:hAnsi="Times New Roman" w:cs="Times New Roman"/>
+          <w:highlight w:val="yellow"/>
+        </w:rPr>
+      </w:pPr>
+      <w:r>
+        <w:rPr>
+          <w:rFonts w:ascii="Times New Roman" w:eastAsia="Calibri" w:hAnsi="Times New Roman" w:cs="Times New Roman"/>
+          <w:highlight w:val="yellow"/>
+        </w:rPr>
+        <w:t xml:space="preserve">· Lumbar Spondylosis </w:t>
+      </w:r>
+      <w:r>
+        <w:rPr>
+          <w:rFonts w:ascii="Times New Roman" w:eastAsia="Calibri" w:hAnsi="Times New Roman" w:cs="Times New Roman"/>
+          <w:highlight w:val="yellow"/>
+        </w:rPr>
+        <w:tab/>
+      </w:r>
+      <w:r>
+        <w:rPr>
+          <w:rFonts w:ascii="Times New Roman" w:eastAsia="Calibri" w:hAnsi="Times New Roman" w:cs="Times New Roman"/>
+          <w:highlight w:val="yellow"/>
+        </w:rPr>
+        <w:tab/>
+      </w:r>
+      <w:r>
+        <w:rPr>
+          <w:rFonts w:ascii="Times New Roman" w:eastAsia="Calibri" w:hAnsi="Times New Roman" w:cs="Times New Roman"/>
+          <w:highlight w:val="yellow"/>
+        </w:rPr>
+        <w:tab/>
+        <w:t xml:space="preserve"> </w:t>
+      </w:r>
+    </w:p>
+    <w:p>
+      <w:pPr>
+        <w:pStyle w:val="ListParagraph"/>
+        <w:numPr>
+          <w:ilvl w:val="0"/>
+          <w:numId w:val="31"/>
+        </w:numPr>
+        <w:jc w:val="both"/>
+        <w:rPr>
+          <w:rFonts w:ascii="Times New Roman" w:eastAsia="Calibri" w:hAnsi="Times New Roman" w:cs="Times New Roman"/>
+        </w:rPr>
+      </w:pPr>
+      <w:r>
+        <w:rPr>
+          <w:rFonts w:ascii="Times New Roman" w:eastAsia="Calibri" w:hAnsi="Times New Roman" w:cs="Times New Roman"/>
+          <w:highlight w:val="yellow"/>
+        </w:rPr>
+        <w:t>· Myositis</w:t>
+      </w:r>
+    </w:p>
+    <w:p>
+      <w:pPr>
+        <w:pStyle w:val="ListParagraph"/>
+        <w:numPr>
+          <w:ilvl w:val="0"/>
+          <w:numId w:val="31"/>
+        </w:numPr>
+        <w:jc w:val="both"/>
+        <w:rPr>
+          <w:rFonts w:ascii="Times New Roman" w:eastAsia="Calibri" w:hAnsi="Times New Roman" w:cs="Times New Roman"/>
+        </w:rPr>
+      </w:pPr>
+      <w:r>
+        <w:rPr>
+          <w:rFonts w:ascii="Times New Roman" w:eastAsia="Calibri" w:hAnsi="Times New Roman" w:cs="Times New Roman"/>
+        </w:rPr>
+        <w:t xml:space="preserve">· MRI of Lumbar Spine </w:t>
+      </w:r>
+    </w:p>
+    <w:p>
+      <w:pPr>
+        <w:pStyle w:val="ListParagraph"/>
+        <w:numPr>
+          <w:ilvl w:val="0"/>
+          <w:numId w:val="31"/>
+        </w:numPr>
+        <w:jc w:val="both"/>
+        <w:rPr>
+          <w:rFonts w:ascii="Times New Roman" w:eastAsia="Calibri" w:hAnsi="Times New Roman" w:cs="Times New Roman"/>
+          <w:highlight w:val="yellow"/>
+        </w:rPr>
+      </w:pPr>
+      <w:r>
+        <w:rPr>
+          <w:rFonts w:ascii="Times New Roman" w:eastAsia="Calibri" w:hAnsi="Times New Roman" w:cs="Times New Roman"/>
+          <w:highlight w:val="yellow"/>
+        </w:rPr>
+        <w:t>· L4-L5 disc bulge.</w:t>
+      </w:r>
+    </w:p>
+    <w:p>
+      <w:pPr>
+        <w:pStyle w:val="ListParagraph"/>
+        <w:numPr>
+          <w:ilvl w:val="0"/>
+          <w:numId w:val="31"/>
+        </w:numPr>
+        <w:jc w:val="both"/>
+        <w:rPr>
+          <w:rFonts w:ascii="Times New Roman" w:eastAsia="Calibri" w:hAnsi="Times New Roman" w:cs="Times New Roman"/>
+          <w:highlight w:val="yellow"/>
+        </w:rPr>
+      </w:pPr>
+      <w:r>
+        <w:rPr>
+          <w:rFonts w:ascii="Times New Roman" w:eastAsia="Calibri" w:hAnsi="Times New Roman" w:cs="Times New Roman"/>
+          <w:highlight w:val="yellow"/>
+        </w:rPr>
+        <w:t xml:space="preserve">· L5-S1 disc bulge. </w:t>
+      </w:r>
+      <w:r>
+        <w:rPr>
+          <w:rFonts w:ascii="Times New Roman" w:eastAsia="Calibri" w:hAnsi="Times New Roman" w:cs="Times New Roman"/>
+          <w:highlight w:val="yellow"/>
+        </w:rPr>
+        <w:tab/>
+      </w:r>
+      <w:r>
+        <w:rPr>
+          <w:rFonts w:ascii="Times New Roman" w:eastAsia="Calibri" w:hAnsi="Times New Roman" w:cs="Times New Roman"/>
+          <w:highlight w:val="yellow"/>
+        </w:rPr>
+        <w:tab/>
+      </w:r>
+    </w:p>
+    <w:p>
+      <w:pPr>
+        <w:pStyle w:val="ListParagraph"/>
+        <w:numPr>
+          <w:ilvl w:val="0"/>
+          <w:numId w:val="31"/>
+        </w:numPr>
+        <w:jc w:val="both"/>
+        <w:rPr>
+          <w:rFonts w:ascii="Times New Roman" w:eastAsia="Calibri" w:hAnsi="Times New Roman" w:cs="Times New Roman"/>
+          <w:highlight w:val="yellow"/>
+        </w:rPr>
+      </w:pPr>
+      <w:r>
+        <w:rPr>
+          <w:rFonts w:ascii="Times New Roman" w:eastAsia="Calibri" w:hAnsi="Times New Roman" w:cs="Times New Roman"/>
+          <w:highlight w:val="yellow"/>
+        </w:rPr>
+        <w:lastRenderedPageBreak/>
+        <w:t xml:space="preserve">· Lower Back Pain </w:t>
+      </w:r>
+    </w:p>
+    <w:p>
+      <w:pPr>
+        <w:pStyle w:val="ListParagraph"/>
+        <w:numPr>
+          <w:ilvl w:val="0"/>
+          <w:numId w:val="31"/>
+        </w:numPr>
+        <w:jc w:val="both"/>
+        <w:rPr>
+          <w:rFonts w:ascii="Times New Roman" w:eastAsia="Calibri" w:hAnsi="Times New Roman" w:cs="Times New Roman"/>
+          <w:highlight w:val="yellow"/>
+        </w:rPr>
+      </w:pPr>
+      <w:r>
+        <w:rPr>
+          <w:rFonts w:ascii="Times New Roman" w:eastAsia="Calibri" w:hAnsi="Times New Roman" w:cs="Times New Roman"/>
+          <w:highlight w:val="yellow"/>
+        </w:rPr>
+        <w:t xml:space="preserve">· Lumbar Radiculopathy </w:t>
+      </w:r>
+      <w:r>
+        <w:rPr>
+          <w:rFonts w:ascii="Times New Roman" w:eastAsia="Calibri" w:hAnsi="Times New Roman" w:cs="Times New Roman"/>
+          <w:highlight w:val="yellow"/>
+        </w:rPr>
+        <w:tab/>
+      </w:r>
+      <w:r>
+        <w:rPr>
+          <w:rFonts w:ascii="Times New Roman" w:eastAsia="Calibri" w:hAnsi="Times New Roman" w:cs="Times New Roman"/>
+          <w:highlight w:val="yellow"/>
+        </w:rPr>
+        <w:tab/>
+      </w:r>
+      <w:r>
+        <w:rPr>
+          <w:rFonts w:ascii="Times New Roman" w:eastAsia="Calibri" w:hAnsi="Times New Roman" w:cs="Times New Roman"/>
+          <w:highlight w:val="yellow"/>
+        </w:rPr>
+        <w:tab/>
+      </w:r>
+    </w:p>
+    <w:p>
+      <w:pPr>
+        <w:pStyle w:val="ListParagraph"/>
+        <w:numPr>
+          <w:ilvl w:val="0"/>
+          <w:numId w:val="31"/>
+        </w:numPr>
+        <w:jc w:val="both"/>
+        <w:rPr>
+          <w:rFonts w:ascii="Times New Roman" w:eastAsia="Calibri" w:hAnsi="Times New Roman" w:cs="Times New Roman"/>
+          <w:highlight w:val="yellow"/>
+        </w:rPr>
+      </w:pPr>
+      <w:r>
+        <w:rPr>
+          <w:rFonts w:ascii="Times New Roman" w:eastAsia="Calibri" w:hAnsi="Times New Roman" w:cs="Times New Roman"/>
+          <w:highlight w:val="yellow"/>
+        </w:rPr>
+        <w:t xml:space="preserve">· Lumbar Spondylosis </w:t>
+      </w:r>
+      <w:r>
+        <w:rPr>
+          <w:rFonts w:ascii="Times New Roman" w:eastAsia="Calibri" w:hAnsi="Times New Roman" w:cs="Times New Roman"/>
+          <w:highlight w:val="yellow"/>
+        </w:rPr>
+        <w:tab/>
+      </w:r>
+      <w:r>
+        <w:rPr>
+          <w:rFonts w:ascii="Times New Roman" w:eastAsia="Calibri" w:hAnsi="Times New Roman" w:cs="Times New Roman"/>
+          <w:highlight w:val="yellow"/>
+        </w:rPr>
+        <w:tab/>
+      </w:r>
+      <w:r>
+        <w:rPr>
+          <w:rFonts w:ascii="Times New Roman" w:eastAsia="Calibri" w:hAnsi="Times New Roman" w:cs="Times New Roman"/>
+          <w:highlight w:val="yellow"/>
+        </w:rPr>
+        <w:tab/>
+        <w:t xml:space="preserve"> </w:t>
+      </w:r>
+    </w:p>
+    <w:p>
+      <w:pPr>
+        <w:pStyle w:val="ListParagraph"/>
+        <w:numPr>
+          <w:ilvl w:val="0"/>
+          <w:numId w:val="31"/>
+        </w:numPr>
+        <w:jc w:val="both"/>
+        <w:rPr>
+          <w:rFonts w:ascii="Times New Roman" w:eastAsia="Calibri" w:hAnsi="Times New Roman" w:cs="Times New Roman"/>
+        </w:rPr>
+      </w:pPr>
+      <w:r>
+        <w:rPr>
+          <w:rFonts w:ascii="Times New Roman" w:eastAsia="Calibri" w:hAnsi="Times New Roman" w:cs="Times New Roman"/>
+          <w:highlight w:val="yellow"/>
+        </w:rPr>
+        <w:t>· Myositis</w:t>
+      </w:r>
+    </w:p>
+    <w:p>
+      <w:pPr>
         <w:ind w:left="720"/>
         <w:jc w:val="both"/>
         <w:rPr>
@@ -2076,6 +2919,7 @@
       <w:r>
         <w:rPr>
           <w:rFonts w:ascii="Times New Roman" w:eastAsia="Calibri" w:hAnsi="Times New Roman" w:cs="Times New Roman"/>
+          <w:highlight w:val="yellow"/>
         </w:rPr>
         <w:t>MR_MRS_CLIENT_LAST_NAME</w:t>
       </w:r>
@@ -2106,6 +2950,7 @@
       <w:r>
         <w:rPr>
           <w:rFonts w:ascii="Times New Roman" w:eastAsia="Calibri" w:hAnsi="Times New Roman" w:cs="Times New Roman"/>
+          <w:highlight w:val="yellow"/>
         </w:rPr>
         <w:t>MR_MRS_CLIENT_LAST_NAME</w:t>
       </w:r>
@@ -2136,6 +2981,7 @@
       <w:r>
         <w:rPr>
           <w:rFonts w:ascii="Times New Roman" w:eastAsia="Calibri" w:hAnsi="Times New Roman" w:cs="Times New Roman"/>
+          <w:highlight w:val="yellow"/>
         </w:rPr>
         <w:t>MR_MRS_CLIENT_LAST_NAME</w:t>
       </w:r>
@@ -2148,6 +2994,7 @@
       <w:r>
         <w:rPr>
           <w:rFonts w:ascii="Times New Roman" w:eastAsia="Calibri" w:hAnsi="Times New Roman" w:cs="Times New Roman"/>
+          <w:highlight w:val="yellow"/>
         </w:rPr>
         <w:t>MR_MRS_CLIENT_LAST_NAME</w:t>
       </w:r>
@@ -2160,6 +3007,7 @@
       <w:r>
         <w:rPr>
           <w:rFonts w:ascii="Times New Roman" w:eastAsia="Calibri" w:hAnsi="Times New Roman" w:cs="Times New Roman"/>
+          <w:highlight w:val="yellow"/>
         </w:rPr>
         <w:t>HER_HIS_CLIENT</w:t>
       </w:r>
@@ -2196,6 +3044,7 @@
       <w:r>
         <w:rPr>
           <w:rFonts w:ascii="Times New Roman" w:eastAsia="Calibri" w:hAnsi="Times New Roman" w:cs="Times New Roman"/>
+          <w:highlight w:val="yellow"/>
         </w:rPr>
         <w:t>MR_MRS_CLIENT_LAST_NAME</w:t>
       </w:r>
@@ -2258,6 +3107,7 @@
       <w:r>
         <w:rPr>
           <w:rFonts w:ascii="Times New Roman" w:eastAsia="Calibri" w:hAnsi="Times New Roman" w:cs="Times New Roman"/>
+          <w:highlight w:val="yellow"/>
         </w:rPr>
         <w:t>INSURED_NAME_EACH_CAP</w:t>
       </w:r>
@@ -2276,6 +3126,7 @@
       <w:r>
         <w:rPr>
           <w:rFonts w:ascii="Times New Roman" w:eastAsia="Calibri" w:hAnsi="Times New Roman" w:cs="Times New Roman"/>
+          <w:highlight w:val="yellow"/>
           <w:shd w:val="clear" w:color="auto" w:fill="FCFCFD"/>
         </w:rPr>
         <w:t>DATE_OF_LOSS_FORMATTED</w:t>
@@ -2304,20 +3155,29 @@
       <w:r>
         <w:rPr>
           <w:rFonts w:ascii="Times New Roman" w:eastAsia="Calibri" w:hAnsi="Times New Roman" w:cs="Times New Roman"/>
+          <w:highlight w:val="yellow"/>
           <w:shd w:val="clear" w:color="auto" w:fill="FCFCFD"/>
         </w:rPr>
-        <w:t xml:space="preserve">CALIFORNIA_CVC_TEXT </w:t>
+        <w:t>CALIFORNIA_CVC_TEXT</w:t>
       </w:r>
       <w:r>
         <w:rPr>
           <w:rFonts w:ascii="Times New Roman" w:eastAsia="Calibri" w:hAnsi="Times New Roman" w:cs="Times New Roman"/>
           <w:shd w:val="clear" w:color="auto" w:fill="FCFCFD"/>
         </w:rPr>
+        <w:t xml:space="preserve"> </w:t>
+      </w:r>
+      <w:r>
+        <w:rPr>
+          <w:rFonts w:ascii="Times New Roman" w:eastAsia="Calibri" w:hAnsi="Times New Roman" w:cs="Times New Roman"/>
+          <w:shd w:val="clear" w:color="auto" w:fill="FCFCFD"/>
+        </w:rPr>
         <w:t xml:space="preserve">The collision of the vehicles caused by driver </w:t>
       </w:r>
       <w:r>
         <w:rPr>
           <w:rFonts w:ascii="Times New Roman" w:eastAsia="Calibri" w:hAnsi="Times New Roman" w:cs="Times New Roman"/>
+          <w:highlight w:val="yellow"/>
           <w:shd w:val="clear" w:color="auto" w:fill="FCFCFD"/>
         </w:rPr>
         <w:t>INSURED_NAME_EACH_CAP</w:t>
@@ -2339,6 +3199,7 @@
       <w:r>
         <w:rPr>
           <w:rFonts w:ascii="Times New Roman" w:eastAsia="Calibri" w:hAnsi="Times New Roman" w:cs="Times New Roman"/>
+          <w:highlight w:val="yellow"/>
           <w:shd w:val="clear" w:color="auto" w:fill="FCFCFD"/>
         </w:rPr>
         <w:t>CLIENT_NAME_EACH_CAP</w:t>
@@ -2383,6 +3244,7 @@
         <w:rPr>
           <w:rFonts w:ascii="Times New Roman" w:eastAsia="Calibri" w:hAnsi="Times New Roman" w:cs="Times New Roman"/>
           <w:b/>
+          <w:highlight w:val="yellow"/>
           <w:shd w:val="clear" w:color="auto" w:fill="FCFCFD"/>
         </w:rPr>
         <w:t>CLIENT_NAME_EACH_CAP</w:t>
@@ -2421,7 +3283,6 @@
           <w:rFonts w:ascii="Times New Roman" w:eastAsia="Calibri" w:hAnsi="Times New Roman" w:cs="Times New Roman"/>
           <w:shd w:val="clear" w:color="auto" w:fill="FCFCFD"/>
         </w:rPr>
-        <w:lastRenderedPageBreak/>
         <w:tab/>
       </w:r>
       <w:r>
@@ -2942,23 +3803,19 @@
           <w:sz w:val="16"/>
           <w:szCs w:val="16"/>
         </w:rPr>
+        <w:lastRenderedPageBreak/>
         <w:t xml:space="preserve"> </w:t>
       </w:r>
       <w:r>
         <w:rPr>
           <w:rFonts w:ascii="Times New Roman" w:hAnsi="Times New Roman" w:cs="Times New Roman"/>
         </w:rPr>
-        <w:t xml:space="preserve">The general and special damages </w:t>
-      </w:r>
-      <w:r>
-        <w:rPr>
-          <w:rFonts w:ascii="Times New Roman" w:hAnsi="Times New Roman" w:cs="Times New Roman"/>
-        </w:rPr>
-        <w:t xml:space="preserve">suffered by </w:t>
-      </w:r>
-      <w:r>
-        <w:rPr>
-          <w:rFonts w:ascii="Times New Roman" w:hAnsi="Times New Roman" w:cs="Times New Roman"/>
+        <w:t xml:space="preserve">The general and special damages suffered by </w:t>
+      </w:r>
+      <w:r>
+        <w:rPr>
+          <w:rFonts w:ascii="Times New Roman" w:hAnsi="Times New Roman" w:cs="Times New Roman"/>
+          <w:highlight w:val="yellow"/>
         </w:rPr>
         <w:t>MR_MRS_CLIENT_LAST_NAME</w:t>
       </w:r>
@@ -2966,11 +3823,26 @@
         <w:rPr>
           <w:rFonts w:ascii="Times New Roman" w:hAnsi="Times New Roman" w:cs="Times New Roman"/>
         </w:rPr>
-        <w:t xml:space="preserve">, as detailed above, are substantially in excess of your insured’s policy limit amount, and we believe that if the case goes to trial </w:t>
-      </w:r>
-      <w:r>
-        <w:rPr>
-          <w:rFonts w:ascii="Times New Roman" w:hAnsi="Times New Roman" w:cs="Times New Roman"/>
+        <w:t xml:space="preserve">, as detailed above, are substantially in excess of your insured’s policy limit amount, and we believe that if the case goes to </w:t>
+      </w:r>
+      <w:proofErr w:type="gramStart"/>
+      <w:r>
+        <w:rPr>
+          <w:rFonts w:ascii="Times New Roman" w:hAnsi="Times New Roman" w:cs="Times New Roman"/>
+        </w:rPr>
+        <w:t>trial</w:t>
+      </w:r>
+      <w:proofErr w:type="gramEnd"/>
+      <w:r>
+        <w:rPr>
+          <w:rFonts w:ascii="Times New Roman" w:hAnsi="Times New Roman" w:cs="Times New Roman"/>
+        </w:rPr>
+        <w:t xml:space="preserve"> </w:t>
+      </w:r>
+      <w:r>
+        <w:rPr>
+          <w:rFonts w:ascii="Times New Roman" w:hAnsi="Times New Roman" w:cs="Times New Roman"/>
+          <w:highlight w:val="yellow"/>
         </w:rPr>
         <w:t>HE_SHE_CLIENT</w:t>
       </w:r>
@@ -2978,13 +3850,7 @@
         <w:rPr>
           <w:rFonts w:ascii="Times New Roman" w:hAnsi="Times New Roman" w:cs="Times New Roman"/>
         </w:rPr>
-        <w:t xml:space="preserve"> will undoubtedly recover far more than</w:t>
-      </w:r>
-      <w:r>
-        <w:rPr>
-          <w:rFonts w:ascii="Times New Roman" w:hAnsi="Times New Roman" w:cs="Times New Roman"/>
-        </w:rPr>
-        <w:t xml:space="preserve"> </w:t>
+        <w:t xml:space="preserve"> will undoubtedly recover far more than </w:t>
       </w:r>
       <w:r>
         <w:rPr>
@@ -3421,14 +4287,7 @@
         <w:rPr>
           <w:rFonts w:ascii="Times New Roman" w:hAnsi="Times New Roman" w:cs="Times New Roman"/>
         </w:rPr>
-        <w:t xml:space="preserve">“As we have seen, the duty of an insurer to consider the insured's interest in settlement offers within the policy limits arises from an implied covenant in the contract, and ordinarily contract duties are strictly enforced and not subject to a standard of reasonableness. Obviously, it will always be in the insured's interest to </w:t>
-      </w:r>
-      <w:r>
-        <w:rPr>
-          <w:rFonts w:ascii="Times New Roman" w:hAnsi="Times New Roman" w:cs="Times New Roman"/>
-        </w:rPr>
-        <w:lastRenderedPageBreak/>
-        <w:t xml:space="preserve">settle within the policy limits when there is any danger, however slight, of a judgment in excess of those limits. Accordingly the rejection of a settlement within the limits where there is any danger of a judgment in excess of the limits can be justified, if at all, only on the basis of the interests of the insurer, and, in light of the common knowledge that settlement is one of the usual methods by which an insured receives protection under a liability policy, it may not be unreasonable for an insured who purchases a policy with limits to believe that a sum of money equal to the limits is available and will be used so as to avoid liability on </w:t>
+        <w:t xml:space="preserve">“As we have seen, the duty of an insurer to consider the insured's interest in settlement offers within the policy limits arises from an implied covenant in the contract, and ordinarily contract duties are strictly enforced and not subject to a standard of reasonableness. Obviously, it will always be in the insured's interest to settle within the policy limits when there is any danger, however slight, of a judgment in excess of those limits. Accordingly the rejection of a settlement within the limits where there is any danger of a judgment in excess of the limits can be justified, if at all, only on the basis of the interests of the insurer, and, in light of the common knowledge that settlement is one of the usual methods by which an insured receives protection under a liability policy, it may not be unreasonable for an insured who purchases a policy with limits to believe that a sum of money equal to the limits is available and will be used so as to avoid liability on </w:t>
       </w:r>
       <w:r>
         <w:rPr>
@@ -3500,6 +4359,7 @@
         <w:rPr>
           <w:rFonts w:ascii="Times New Roman" w:hAnsi="Times New Roman" w:cs="Times New Roman"/>
         </w:rPr>
+        <w:lastRenderedPageBreak/>
         <w:t xml:space="preserve">Finally, and most importantly, there is more than a small amount of elementary justice in a rule that would require that, in this situation where the insurer's and insured's interests necessarily conflict, the insurer, which may reap the benefits of its determination not to settle, should also suffer the detriments of its decision.” </w:t>
       </w:r>
       <w:r>
@@ -3660,6 +4520,7 @@
       <w:r>
         <w:rPr>
           <w:rFonts w:ascii="Times New Roman" w:hAnsi="Times New Roman" w:cs="Times New Roman"/>
+          <w:highlight w:val="yellow"/>
         </w:rPr>
         <w:t>MR_MRS_CLIENT_LAST_NAME</w:t>
       </w:r>
@@ -3667,11 +4528,18 @@
         <w:rPr>
           <w:rFonts w:ascii="Times New Roman" w:hAnsi="Times New Roman" w:cs="Times New Roman"/>
         </w:rPr>
-        <w:t xml:space="preserve">’s injuries have had exceeds the scope of this letter. Suffice it to say that </w:t>
-      </w:r>
-      <w:r>
-        <w:rPr>
-          <w:rFonts w:ascii="Times New Roman" w:hAnsi="Times New Roman" w:cs="Times New Roman"/>
+        <w:t>’s</w:t>
+      </w:r>
+      <w:r>
+        <w:rPr>
+          <w:rFonts w:ascii="Times New Roman" w:hAnsi="Times New Roman" w:cs="Times New Roman"/>
+        </w:rPr>
+        <w:t xml:space="preserve"> injuries have had exceeds the scope of this letter. Suffice it to say that </w:t>
+      </w:r>
+      <w:r>
+        <w:rPr>
+          <w:rFonts w:ascii="Times New Roman" w:hAnsi="Times New Roman" w:cs="Times New Roman"/>
+          <w:highlight w:val="yellow"/>
         </w:rPr>
         <w:t>HE_SHE_CLIENT</w:t>
       </w:r>
@@ -3679,7 +4547,19 @@
         <w:rPr>
           <w:rFonts w:ascii="Times New Roman" w:hAnsi="Times New Roman" w:cs="Times New Roman"/>
         </w:rPr>
-        <w:t xml:space="preserve"> would make an extremely sympathetic witness and his story can easily be expected to move a jury to return a significant award.  </w:t>
+        <w:t xml:space="preserve"> would make an extremely sympathetic witness and </w:t>
+      </w:r>
+      <w:r>
+        <w:rPr>
+          <w:rFonts w:ascii="Times New Roman" w:hAnsi="Times New Roman" w:cs="Times New Roman"/>
+        </w:rPr>
+        <w:t>his</w:t>
+      </w:r>
+      <w:r>
+        <w:rPr>
+          <w:rFonts w:ascii="Times New Roman" w:hAnsi="Times New Roman" w:cs="Times New Roman"/>
+        </w:rPr>
+        <w:t xml:space="preserve"> story can easily be expected to move a jury to return a significant award.  </w:t>
       </w:r>
     </w:p>
     <w:p>
@@ -3713,6 +4593,7 @@
       <w:r>
         <w:rPr>
           <w:rFonts w:ascii="Times New Roman" w:hAnsi="Times New Roman" w:cs="Times New Roman"/>
+          <w:highlight w:val="yellow"/>
         </w:rPr>
         <w:t>MR_MRS_CLIENT_LAST_NAME</w:t>
       </w:r>
@@ -3720,7 +4601,19 @@
         <w:rPr>
           <w:rFonts w:ascii="Times New Roman" w:hAnsi="Times New Roman" w:cs="Times New Roman"/>
         </w:rPr>
-        <w:t xml:space="preserve"> experienced as a result of his injuries. </w:t>
+        <w:t xml:space="preserve"> experienced as a result of </w:t>
+      </w:r>
+      <w:r>
+        <w:rPr>
+          <w:rFonts w:ascii="Times New Roman" w:hAnsi="Times New Roman" w:cs="Times New Roman"/>
+        </w:rPr>
+        <w:t>his</w:t>
+      </w:r>
+      <w:r>
+        <w:rPr>
+          <w:rFonts w:ascii="Times New Roman" w:hAnsi="Times New Roman" w:cs="Times New Roman"/>
+        </w:rPr>
+        <w:t xml:space="preserve"> injuries. </w:t>
       </w:r>
     </w:p>
     <w:p>
@@ -3782,13 +4675,13 @@
           <w:rFonts w:ascii="Times New Roman" w:hAnsi="Times New Roman" w:cs="Times New Roman"/>
           <w:b/>
         </w:rPr>
-        <w:lastRenderedPageBreak/>
         <w:t xml:space="preserve">AS SUCH, OUR CLIENT HEREIN OFFERS TO SETTLE </w:t>
       </w:r>
       <w:r>
         <w:rPr>
           <w:rFonts w:ascii="Times New Roman" w:hAnsi="Times New Roman" w:cs="Times New Roman"/>
           <w:b/>
+          <w:highlight w:val="yellow"/>
         </w:rPr>
         <w:t>HER_HIS_CLIENT_CAP</w:t>
       </w:r>
@@ -3804,7 +4697,14 @@
           <w:rFonts w:ascii="Times New Roman" w:hAnsi="Times New Roman" w:cs="Times New Roman"/>
           <w:b/>
         </w:rPr>
-        <w:t xml:space="preserve">CLAIM FOR THE TENDER OF THE BODILY INJURY </w:t>
+        <w:t xml:space="preserve">CLAIM FOR THE </w:t>
+      </w:r>
+      <w:r>
+        <w:rPr>
+          <w:rFonts w:ascii="Times New Roman" w:hAnsi="Times New Roman" w:cs="Times New Roman"/>
+          <w:b/>
+        </w:rPr>
+        <w:t xml:space="preserve">TENDER OF THE BODILY INJURY </w:t>
       </w:r>
       <w:r>
         <w:rPr>
@@ -3827,7 +4727,7 @@
           <w:b/>
           <w:u w:val="single"/>
         </w:rPr>
-        <w:t xml:space="preserve">THIS OFFER SHALL EXPIRE AT 5:00 P.M. ON </w:t>
+        <w:t xml:space="preserve">THIS OFFER SHALL EXPIRE AT </w:t>
       </w:r>
       <w:r>
         <w:rPr>
@@ -3835,12 +4735,22 @@
           <w:b/>
           <w:u w:val="single"/>
         </w:rPr>
+        <w:t xml:space="preserve">5:00 P.M. ON </w:t>
+      </w:r>
+      <w:r>
+        <w:rPr>
+          <w:rFonts w:ascii="Times New Roman" w:hAnsi="Times New Roman" w:cs="Times New Roman"/>
+          <w:b/>
+          <w:highlight w:val="yellow"/>
+          <w:u w:val="single"/>
+        </w:rPr>
         <w:t>SETTLEMENT_EXP_DATE</w:t>
       </w:r>
       <w:r>
         <w:rPr>
           <w:rFonts w:ascii="Times New Roman" w:hAnsi="Times New Roman" w:cs="Times New Roman"/>
           <w:b/>
+          <w:highlight w:val="yellow"/>
           <w:u w:val="single"/>
         </w:rPr>
         <w:t>.</w:t>
@@ -3883,6 +4793,7 @@
         <w:rPr>
           <w:rFonts w:ascii="Times New Roman" w:hAnsi="Times New Roman" w:cs="Times New Roman"/>
           <w:b/>
+          <w:highlight w:val="yellow"/>
           <w:u w:val="single"/>
         </w:rPr>
         <w:t>INSURANCE_NAME_CAP</w:t>
@@ -3899,6 +4810,7 @@
         <w:rPr>
           <w:rFonts w:ascii="Times New Roman" w:hAnsi="Times New Roman" w:cs="Times New Roman"/>
           <w:b/>
+          <w:highlight w:val="yellow"/>
           <w:u w:val="single"/>
         </w:rPr>
         <w:t>SETTLEMENT_EXP_DATE</w:t>
@@ -3907,6 +4819,7 @@
         <w:rPr>
           <w:rFonts w:ascii="Times New Roman" w:hAnsi="Times New Roman" w:cs="Times New Roman"/>
           <w:b/>
+          <w:highlight w:val="yellow"/>
           <w:u w:val="single"/>
         </w:rPr>
         <w:t>:</w:t>
@@ -3959,6 +4872,7 @@
         <w:rPr>
           <w:rFonts w:ascii="Times New Roman" w:hAnsi="Times New Roman" w:cs="Times New Roman"/>
           <w:b/>
+          <w:highlight w:val="yellow"/>
         </w:rPr>
         <w:t>SETTLEMENT_EXP_DATE</w:t>
       </w:r>
@@ -3991,6 +4905,7 @@
           <w:rFonts w:ascii="Times New Roman" w:hAnsi="Times New Roman" w:cs="Times New Roman"/>
           <w:b/>
         </w:rPr>
+        <w:lastRenderedPageBreak/>
         <w:t xml:space="preserve">SEND A COPY OF A STANDARD </w:t>
       </w:r>
       <w:r>
@@ -4005,12 +4920,27 @@
           <w:rFonts w:ascii="Times New Roman" w:hAnsi="Times New Roman" w:cs="Times New Roman"/>
           <w:b/>
         </w:rPr>
-        <w:t xml:space="preserve">   RELEASE FOR </w:t>
-      </w:r>
-      <w:r>
-        <w:rPr>
-          <w:rFonts w:ascii="Times New Roman" w:hAnsi="Times New Roman" w:cs="Times New Roman"/>
-          <w:b/>
+        <w:t xml:space="preserve">  </w:t>
+      </w:r>
+      <w:r>
+        <w:rPr>
+          <w:rFonts w:ascii="Times New Roman" w:hAnsi="Times New Roman" w:cs="Times New Roman"/>
+          <w:b/>
+        </w:rPr>
+        <w:t xml:space="preserve"> </w:t>
+      </w:r>
+      <w:r>
+        <w:rPr>
+          <w:rFonts w:ascii="Times New Roman" w:hAnsi="Times New Roman" w:cs="Times New Roman"/>
+          <w:b/>
+        </w:rPr>
+        <w:t xml:space="preserve">RELEASE FOR </w:t>
+      </w:r>
+      <w:r>
+        <w:rPr>
+          <w:rFonts w:ascii="Times New Roman" w:hAnsi="Times New Roman" w:cs="Times New Roman"/>
+          <w:b/>
+          <w:highlight w:val="yellow"/>
         </w:rPr>
         <w:t>MR_OR_MRS_INSURED_NAME_ALL_CAP</w:t>
       </w:r>
@@ -4049,6 +4979,7 @@
         <w:rPr>
           <w:rFonts w:ascii="Times New Roman" w:hAnsi="Times New Roman" w:cs="Times New Roman"/>
           <w:b/>
+          <w:highlight w:val="yellow"/>
         </w:rPr>
         <w:t>MR_OR_MRS_INSURED_NAME_ALL_CAP</w:t>
       </w:r>
@@ -4156,6 +5087,7 @@
         <w:rPr>
           <w:rFonts w:ascii="Times New Roman" w:hAnsi="Times New Roman" w:cs="Times New Roman"/>
           <w:b/>
+          <w:highlight w:val="yellow"/>
         </w:rPr>
         <w:t>CLIENT_NAME_ALL_CAP</w:t>
       </w:r>
@@ -4199,7 +5131,7 @@
           <w:b/>
           <w:u w:val="single"/>
         </w:rPr>
-        <w:t xml:space="preserve">AGAIN, TO BE CLEAR, YOUR ACCEPTANCE OF THE AFOREMENTIONED SETTLEMENT OFFER MUST BE IN WRITING, AND MUST BE COMMUNICATED TO OUR OFFICE VIA FACSIMILE TO: (424) 429-2432 OR EMAIL TO LILLIAN@SEDLAWGROUP.COM, ON OR BEFORE 5:00 P.M. ON </w:t>
+        <w:t xml:space="preserve">AGAIN, TO BE CLEAR, YOUR ACCEPTANCE OF THE AFOREMENTIONED SETTLEMENT OFFER MUST BE IN WRITING, AND MUST BE COMMUNICATED TO OUR OFFICE VIA FACSIMILE TO: </w:t>
       </w:r>
       <w:r>
         <w:rPr>
@@ -4207,6 +5139,39 @@
           <w:b/>
           <w:u w:val="single"/>
         </w:rPr>
+        <w:t xml:space="preserve">(424) 429-2432 </w:t>
+      </w:r>
+      <w:r>
+        <w:rPr>
+          <w:rFonts w:ascii="Times New Roman" w:hAnsi="Times New Roman" w:cs="Times New Roman"/>
+          <w:b/>
+          <w:u w:val="single"/>
+        </w:rPr>
+        <w:t xml:space="preserve">OR EMAIL TO </w:t>
+      </w:r>
+      <w:r>
+        <w:rPr>
+          <w:rFonts w:ascii="Times New Roman" w:hAnsi="Times New Roman" w:cs="Times New Roman"/>
+          <w:b/>
+          <w:u w:val="single"/>
+        </w:rPr>
+        <w:t>LILLIAN@SEDLAWGROUP.COM</w:t>
+      </w:r>
+      <w:r>
+        <w:rPr>
+          <w:rFonts w:ascii="Times New Roman" w:hAnsi="Times New Roman" w:cs="Times New Roman"/>
+          <w:b/>
+          <w:u w:val="single"/>
+        </w:rPr>
+        <w:t xml:space="preserve">, ON OR BEFORE 5:00 P.M. ON </w:t>
+      </w:r>
+      <w:r>
+        <w:rPr>
+          <w:rFonts w:ascii="Times New Roman" w:hAnsi="Times New Roman" w:cs="Times New Roman"/>
+          <w:b/>
+          <w:highlight w:val="yellow"/>
+          <w:u w:val="single"/>
+        </w:rPr>
         <w:t>SETTLEMENT_EXP_DATE</w:t>
       </w:r>
       <w:r>
@@ -4247,14 +5212,7 @@
           <w:rFonts w:ascii="Times New Roman" w:hAnsi="Times New Roman" w:cs="Times New Roman"/>
           <w:b/>
         </w:rPr>
-        <w:t>I have enclosed herewith copies of all known records, documentation and information that you will need for evaluating each of my clients claims herein. The damages sustained by each of our clients far exceed the full aggregate policy carried by your insured. We therefore believe that you are in a position to act promptly upon this demand and tender the full aggregate policy limits carried by your insured.</w:t>
-      </w:r>
-      <w:r>
-        <w:rPr>
-          <w:rFonts w:ascii="Times New Roman" w:hAnsi="Times New Roman" w:cs="Times New Roman"/>
-          <w:b/>
-        </w:rPr>
-        <w:t xml:space="preserve"> </w:t>
+        <w:t xml:space="preserve">I have enclosed herewith copies of all known records, documentation and information that you will need for evaluating each of my clients claims herein. The damages sustained by each of our clients far exceed the full aggregate policy carried by your insured. We therefore believe that you are in a position to act promptly upon this demand and tender the full aggregate policy limits carried by your insured. </w:t>
       </w:r>
     </w:p>
     <w:p>
@@ -4288,7 +5246,6 @@
           <w:rFonts w:ascii="Times New Roman" w:hAnsi="Times New Roman" w:cs="Times New Roman"/>
           <w:bCs/>
         </w:rPr>
-        <w:lastRenderedPageBreak/>
         <w:t xml:space="preserve">For your reference and file, and to expedite the issuance of any and all drafts, a copy of our firm’s W-9 form is attached and enclosed with this correspondence herein and marked as </w:t>
       </w:r>
       <w:r>
@@ -4393,7 +5350,15 @@
           <w:rFonts w:ascii="Times New Roman" w:hAnsi="Times New Roman" w:cs="Times New Roman"/>
           <w:b/>
         </w:rPr>
-        <w:t>Please be advised that in the event you refuse to offer our client your insured’s full policy limit for consideration, and our client is forced to litigate, due to the increased fees associates with litigation, as well as the enormous costs involved, our client has instructed this office not to accept your insured’s policy limits at that time and will pursue your insured for a verdict in excess of their policy limits, therefore, our above offer to consider settlement is valid for the purpose of this settlement demand only.</w:t>
+        <w:t xml:space="preserve">Please be advised that in the event you refuse to offer our client your insured’s full policy limit for consideration, and our client is forced to litigate, due to the increased fees associates with litigation, as well as the enormous costs involved, our client has instructed this office not to accept your insured’s policy limits at that time and will pursue your insured for a verdict in excess of </w:t>
+      </w:r>
+      <w:r>
+        <w:rPr>
+          <w:rFonts w:ascii="Times New Roman" w:hAnsi="Times New Roman" w:cs="Times New Roman"/>
+          <w:b/>
+        </w:rPr>
+        <w:lastRenderedPageBreak/>
+        <w:t>their policy limits, therefore, our above offer to consider settlement is valid for the purpose of this settlement demand only.</w:t>
       </w:r>
     </w:p>
     <w:p>
@@ -4479,7 +5444,21 @@
         <w:rPr>
           <w:rFonts w:ascii="Times New Roman" w:hAnsi="Times New Roman" w:cs="Times New Roman"/>
         </w:rPr>
-        <w:t>Again, this offer to settle our client’s claims for the</w:t>
+        <w:t xml:space="preserve">Again, this </w:t>
+      </w:r>
+      <w:proofErr w:type="gramStart"/>
+      <w:r>
+        <w:rPr>
+          <w:rFonts w:ascii="Times New Roman" w:hAnsi="Times New Roman" w:cs="Times New Roman"/>
+        </w:rPr>
+        <w:t>offer</w:t>
+      </w:r>
+      <w:proofErr w:type="gramEnd"/>
+      <w:r>
+        <w:rPr>
+          <w:rFonts w:ascii="Times New Roman" w:hAnsi="Times New Roman" w:cs="Times New Roman"/>
+        </w:rPr>
+        <w:t xml:space="preserve"> to settle our client’s claims for the</w:t>
       </w:r>
       <w:r>
         <w:rPr>
@@ -4500,13 +5479,7 @@
         <w:rPr>
           <w:rFonts w:ascii="Times New Roman" w:hAnsi="Times New Roman" w:cs="Times New Roman"/>
         </w:rPr>
-        <w:t xml:space="preserve"> maintained by your insured </w:t>
-      </w:r>
-      <w:r>
-        <w:rPr>
-          <w:rFonts w:ascii="Times New Roman" w:hAnsi="Times New Roman" w:cs="Times New Roman"/>
-        </w:rPr>
-        <w:t xml:space="preserve">regarding the subject accident shall remain open for acceptance until </w:t>
+        <w:t xml:space="preserve"> maintained by your insured regarding the subject accident shall remain open for acceptance until </w:t>
       </w:r>
       <w:r>
         <w:rPr>
@@ -4520,6 +5493,7 @@
         <w:rPr>
           <w:rFonts w:ascii="Times New Roman" w:hAnsi="Times New Roman" w:cs="Times New Roman"/>
           <w:b/>
+          <w:highlight w:val="yellow"/>
           <w:u w:val="single"/>
         </w:rPr>
         <w:t>SETTLEMENT_EXP_DATE</w:t>
@@ -4528,6 +5502,7 @@
         <w:rPr>
           <w:rFonts w:ascii="Times New Roman" w:hAnsi="Times New Roman" w:cs="Times New Roman"/>
           <w:b/>
+          <w:highlight w:val="yellow"/>
         </w:rPr>
         <w:t>.</w:t>
       </w:r>
@@ -4600,6 +5575,7 @@
       <w:r>
         <w:rPr>
           <w:rFonts w:ascii="Times New Roman" w:hAnsi="Times New Roman" w:cs="Times New Roman"/>
+          <w:highlight w:val="yellow"/>
         </w:rPr>
         <w:t>MR_MRS_CLIENT_LAST_NAME</w:t>
       </w:r>
@@ -4613,17 +5589,31 @@
         <w:rPr>
           <w:rFonts w:ascii="Times New Roman" w:eastAsia="Times New Roman" w:hAnsi="Times New Roman" w:cs="Times New Roman"/>
         </w:rPr>
-        <w:t xml:space="preserve">Juries are receptive to claims for general damages when a healthy </w:t>
+        <w:t xml:space="preserve">Juries are receptive to claims for general damages when </w:t>
       </w:r>
       <w:r>
         <w:rPr>
           <w:rFonts w:ascii="Times New Roman" w:eastAsia="Times New Roman" w:hAnsi="Times New Roman" w:cs="Times New Roman"/>
         </w:rPr>
-        <w:t xml:space="preserve">IS_YOUNG </w:t>
+        <w:t xml:space="preserve">a healthy </w:t>
       </w:r>
       <w:r>
         <w:rPr>
           <w:rFonts w:ascii="Times New Roman" w:eastAsia="Times New Roman" w:hAnsi="Times New Roman" w:cs="Times New Roman"/>
+          <w:highlight w:val="yellow"/>
+        </w:rPr>
+        <w:t>IS_YOUNG</w:t>
+      </w:r>
+      <w:r>
+        <w:rPr>
+          <w:rFonts w:ascii="Times New Roman" w:eastAsia="Times New Roman" w:hAnsi="Times New Roman" w:cs="Times New Roman"/>
+        </w:rPr>
+        <w:t xml:space="preserve"> </w:t>
+      </w:r>
+      <w:r>
+        <w:rPr>
+          <w:rFonts w:ascii="Times New Roman" w:eastAsia="Times New Roman" w:hAnsi="Times New Roman" w:cs="Times New Roman"/>
+          <w:highlight w:val="yellow"/>
         </w:rPr>
         <w:t>WOMAN_MAN</w:t>
       </w:r>
@@ -4631,19 +5621,44 @@
         <w:rPr>
           <w:rFonts w:ascii="Times New Roman" w:eastAsia="Times New Roman" w:hAnsi="Times New Roman" w:cs="Times New Roman"/>
         </w:rPr>
-        <w:t xml:space="preserve"> loses </w:t>
+        <w:t xml:space="preserve"> </w:t>
       </w:r>
       <w:r>
         <w:rPr>
           <w:rFonts w:ascii="Times New Roman" w:eastAsia="Times New Roman" w:hAnsi="Times New Roman" w:cs="Times New Roman"/>
         </w:rPr>
+        <w:t>lose</w:t>
+      </w:r>
+      <w:r>
+        <w:rPr>
+          <w:rFonts w:ascii="Times New Roman" w:eastAsia="Times New Roman" w:hAnsi="Times New Roman" w:cs="Times New Roman"/>
+        </w:rPr>
+        <w:t>s</w:t>
+      </w:r>
+      <w:r>
+        <w:rPr>
+          <w:rFonts w:ascii="Times New Roman" w:eastAsia="Times New Roman" w:hAnsi="Times New Roman" w:cs="Times New Roman"/>
+        </w:rPr>
+        <w:t xml:space="preserve"> </w:t>
+      </w:r>
+      <w:r>
+        <w:rPr>
+          <w:rFonts w:ascii="Times New Roman" w:eastAsia="Times New Roman" w:hAnsi="Times New Roman" w:cs="Times New Roman"/>
+          <w:highlight w:val="yellow"/>
+        </w:rPr>
         <w:t>HER_HIS_CLIENT</w:t>
       </w:r>
       <w:r>
         <w:rPr>
           <w:rFonts w:ascii="Times New Roman" w:eastAsia="Times New Roman" w:hAnsi="Times New Roman" w:cs="Times New Roman"/>
         </w:rPr>
-        <w:t xml:space="preserve"> means of livelihood and the ability to enjoy recreational and familial activities because of physical injury. </w:t>
+        <w:t xml:space="preserve"> means of livelihood and the ability to enjoy recreational and familial activities</w:t>
+      </w:r>
+      <w:r>
+        <w:rPr>
+          <w:rFonts w:ascii="Times New Roman" w:eastAsia="Times New Roman" w:hAnsi="Times New Roman" w:cs="Times New Roman"/>
+        </w:rPr>
+        <w:t xml:space="preserve"> because of physical injury. </w:t>
       </w:r>
     </w:p>
     <w:p>
@@ -4684,6 +5699,7 @@
       <w:r>
         <w:rPr>
           <w:rFonts w:ascii="Times New Roman" w:hAnsi="Times New Roman" w:cs="Times New Roman"/>
+          <w:highlight w:val="yellow"/>
         </w:rPr>
         <w:t>MR_MRS_CLIENT_LAST_NAME</w:t>
       </w:r>
@@ -4702,6 +5718,7 @@
       <w:r>
         <w:rPr>
           <w:rFonts w:ascii="Times New Roman" w:eastAsia="Times New Roman" w:hAnsi="Times New Roman" w:cs="Times New Roman"/>
+          <w:highlight w:val="yellow"/>
         </w:rPr>
         <w:t>HER_HIS_CLIENT</w:t>
       </w:r>
@@ -4720,14 +5737,28 @@
       <w:r>
         <w:rPr>
           <w:rFonts w:ascii="Times New Roman" w:hAnsi="Times New Roman" w:cs="Times New Roman"/>
+          <w:highlight w:val="yellow"/>
         </w:rPr>
         <w:t>MR_MRS_CLIENT_LAST_NAME</w:t>
       </w:r>
       <w:r>
         <w:rPr>
           <w:rFonts w:ascii="Times New Roman" w:hAnsi="Times New Roman" w:cs="Times New Roman"/>
-        </w:rPr>
-        <w:t>’s injuries. We anticipate your evaluation of our client’s settlement demand in light of this factor.</w:t>
+          <w:highlight w:val="yellow"/>
+        </w:rPr>
+        <w:t>’</w:t>
+      </w:r>
+      <w:r>
+        <w:rPr>
+          <w:rFonts w:ascii="Times New Roman" w:hAnsi="Times New Roman" w:cs="Times New Roman"/>
+        </w:rPr>
+        <w:t>s</w:t>
+      </w:r>
+      <w:r>
+        <w:rPr>
+          <w:rFonts w:ascii="Times New Roman" w:hAnsi="Times New Roman" w:cs="Times New Roman"/>
+        </w:rPr>
+        <w:t xml:space="preserve"> injuries. We anticipate your evaluation of our client’s settlement demand in light of this factor.</w:t>
       </w:r>
     </w:p>
     <w:p>
@@ -4757,12 +5788,12 @@
         <w:rPr>
           <w:rFonts w:ascii="Times New Roman" w:eastAsia="Times New Roman" w:hAnsi="Times New Roman" w:cs="Times New Roman"/>
         </w:rPr>
-        <w:lastRenderedPageBreak/>
         <w:t xml:space="preserve">Based on the foregoing facts, we respectfully request that </w:t>
       </w:r>
       <w:r>
         <w:rPr>
           <w:rFonts w:ascii="Times New Roman" w:eastAsia="Times New Roman" w:hAnsi="Times New Roman" w:cs="Times New Roman"/>
+          <w:highlight w:val="yellow"/>
         </w:rPr>
         <w:t>INSURANCE_NAME</w:t>
       </w:r>
@@ -4770,12 +5801,18 @@
         <w:rPr>
           <w:rFonts w:ascii="Times New Roman" w:eastAsia="Times New Roman" w:hAnsi="Times New Roman" w:cs="Times New Roman"/>
         </w:rPr>
-        <w:t xml:space="preserve"> consider its initial response so as to represent an offer that reasonably puts our client in the </w:t>
+        <w:t xml:space="preserve"> </w:t>
       </w:r>
       <w:r>
         <w:rPr>
           <w:rFonts w:ascii="Times New Roman" w:eastAsia="Times New Roman" w:hAnsi="Times New Roman" w:cs="Times New Roman"/>
         </w:rPr>
+        <w:t xml:space="preserve">consider its initial response so as to represent an offer that reasonably puts our client in the </w:t>
+      </w:r>
+      <w:r>
+        <w:rPr>
+          <w:rFonts w:ascii="Times New Roman" w:eastAsia="Times New Roman" w:hAnsi="Times New Roman" w:cs="Times New Roman"/>
+        </w:rPr>
         <w:t>position,</w:t>
       </w:r>
       <w:r>
@@ -4787,6 +5824,7 @@
       <w:r>
         <w:rPr>
           <w:rFonts w:ascii="Times New Roman" w:eastAsia="Times New Roman" w:hAnsi="Times New Roman" w:cs="Times New Roman"/>
+          <w:highlight w:val="yellow"/>
         </w:rPr>
         <w:t>HE_SHE_CLIENT</w:t>
       </w:r>
@@ -4794,19 +5832,38 @@
         <w:rPr>
           <w:rFonts w:ascii="Times New Roman" w:eastAsia="Times New Roman" w:hAnsi="Times New Roman" w:cs="Times New Roman"/>
         </w:rPr>
-        <w:t xml:space="preserve"> was in before this loss, which is nothing less than the tender of your insured’s policy limits. We trust that </w:t>
+        <w:t xml:space="preserve"> was in before this loss</w:t>
       </w:r>
       <w:r>
         <w:rPr>
           <w:rFonts w:ascii="Times New Roman" w:eastAsia="Times New Roman" w:hAnsi="Times New Roman" w:cs="Times New Roman"/>
         </w:rPr>
+        <w:t>, which is nothing less than the tender of your insured’s policy limits</w:t>
+      </w:r>
+      <w:r>
+        <w:rPr>
+          <w:rFonts w:ascii="Times New Roman" w:eastAsia="Times New Roman" w:hAnsi="Times New Roman" w:cs="Times New Roman"/>
+        </w:rPr>
+        <w:t xml:space="preserve">. We trust that </w:t>
+      </w:r>
+      <w:r>
+        <w:rPr>
+          <w:rFonts w:ascii="Times New Roman" w:eastAsia="Times New Roman" w:hAnsi="Times New Roman" w:cs="Times New Roman"/>
+          <w:highlight w:val="yellow"/>
+        </w:rPr>
         <w:t>INSURANCE_NAME</w:t>
       </w:r>
       <w:r>
         <w:rPr>
           <w:rFonts w:ascii="Times New Roman" w:eastAsia="Times New Roman" w:hAnsi="Times New Roman" w:cs="Times New Roman"/>
         </w:rPr>
-        <w:t xml:space="preserve"> will honor its fiduciary duty to its insured and proffer the policy limits for the injuries your insured negligently caused our client. </w:t>
+        <w:t xml:space="preserve"> </w:t>
+      </w:r>
+      <w:r>
+        <w:rPr>
+          <w:rFonts w:ascii="Times New Roman" w:eastAsia="Times New Roman" w:hAnsi="Times New Roman" w:cs="Times New Roman"/>
+        </w:rPr>
+        <w:t xml:space="preserve">will honor its fiduciary duty to its insured and proffer the policy limits for the injuries your insured negligently caused our client. </w:t>
       </w:r>
     </w:p>
     <w:p>
@@ -4913,7 +5970,50 @@
         <w:rPr>
           <w:rFonts w:ascii="Times New Roman" w:hAnsi="Times New Roman" w:cs="Times New Roman"/>
         </w:rPr>
-        <w:t xml:space="preserve">Where the insurer knows there is a risk that the injured party may obtain a verdict against its insured for more than policy limits, it must keep the insured informed of settlement demands from the third party: </w:t>
+        <w:lastRenderedPageBreak/>
+        <w:t>Where the insurer knows there is a risk</w:t>
+      </w:r>
+      <w:r>
+        <w:rPr>
+          <w:rFonts w:ascii="Times New Roman" w:hAnsi="Times New Roman" w:cs="Times New Roman"/>
+        </w:rPr>
+        <w:t xml:space="preserve"> </w:t>
+      </w:r>
+      <w:r>
+        <w:rPr>
+          <w:rFonts w:ascii="Times New Roman" w:hAnsi="Times New Roman" w:cs="Times New Roman"/>
+        </w:rPr>
+        <w:t xml:space="preserve">that the injured </w:t>
+      </w:r>
+      <w:r>
+        <w:rPr>
+          <w:rFonts w:ascii="Times New Roman" w:hAnsi="Times New Roman" w:cs="Times New Roman"/>
+        </w:rPr>
+        <w:t>party</w:t>
+      </w:r>
+      <w:r>
+        <w:rPr>
+          <w:rFonts w:ascii="Times New Roman" w:hAnsi="Times New Roman" w:cs="Times New Roman"/>
+        </w:rPr>
+        <w:t xml:space="preserve"> may obtain a verdict against its insured for more than policy limits, it must</w:t>
+      </w:r>
+      <w:r>
+        <w:rPr>
+          <w:rFonts w:ascii="Times New Roman" w:hAnsi="Times New Roman" w:cs="Times New Roman"/>
+        </w:rPr>
+        <w:t xml:space="preserve"> </w:t>
+      </w:r>
+      <w:r>
+        <w:rPr>
+          <w:rFonts w:ascii="Times New Roman" w:hAnsi="Times New Roman" w:cs="Times New Roman"/>
+        </w:rPr>
+        <w:t>keep the insured informed of settlement demands from the third party:</w:t>
+      </w:r>
+      <w:r>
+        <w:rPr>
+          <w:rFonts w:ascii="Times New Roman" w:hAnsi="Times New Roman" w:cs="Times New Roman"/>
+        </w:rPr>
+        <w:t xml:space="preserve"> </w:t>
       </w:r>
     </w:p>
     <w:p>
@@ -4947,11 +6047,54 @@
         <w:rPr>
           <w:rFonts w:ascii="Times New Roman" w:hAnsi="Times New Roman" w:cs="Times New Roman"/>
         </w:rPr>
-        <w:t xml:space="preserve">“The company, having the right to select counsel to defend the insured, had the duty to communicate to [the insured] the results of any investigation indicating liability in excess of policy limits, and any offers of settlement which were made so that </w:t>
-      </w:r>
-      <w:r>
-        <w:rPr>
-          <w:rFonts w:ascii="Times New Roman" w:hAnsi="Times New Roman" w:cs="Times New Roman"/>
+        <w:t>“</w:t>
+      </w:r>
+      <w:r>
+        <w:rPr>
+          <w:rFonts w:ascii="Times New Roman" w:hAnsi="Times New Roman" w:cs="Times New Roman"/>
+        </w:rPr>
+        <w:t>The company, having the right to select counsel to defend the</w:t>
+      </w:r>
+      <w:r>
+        <w:rPr>
+          <w:rFonts w:ascii="Times New Roman" w:hAnsi="Times New Roman" w:cs="Times New Roman"/>
+        </w:rPr>
+        <w:t xml:space="preserve"> </w:t>
+      </w:r>
+      <w:r>
+        <w:rPr>
+          <w:rFonts w:ascii="Times New Roman" w:hAnsi="Times New Roman" w:cs="Times New Roman"/>
+        </w:rPr>
+        <w:t>insured, had the duty to communicate to [the insured] the results of</w:t>
+      </w:r>
+      <w:r>
+        <w:rPr>
+          <w:rFonts w:ascii="Times New Roman" w:hAnsi="Times New Roman" w:cs="Times New Roman"/>
+        </w:rPr>
+        <w:t xml:space="preserve"> </w:t>
+      </w:r>
+      <w:r>
+        <w:rPr>
+          <w:rFonts w:ascii="Times New Roman" w:hAnsi="Times New Roman" w:cs="Times New Roman"/>
+        </w:rPr>
+        <w:t>any investigation indicating liability in excess of policy limits, and</w:t>
+      </w:r>
+      <w:r>
+        <w:rPr>
+          <w:rFonts w:ascii="Times New Roman" w:hAnsi="Times New Roman" w:cs="Times New Roman"/>
+        </w:rPr>
+        <w:t xml:space="preserve"> </w:t>
+      </w:r>
+      <w:r>
+        <w:rPr>
+          <w:rFonts w:ascii="Times New Roman" w:hAnsi="Times New Roman" w:cs="Times New Roman"/>
+        </w:rPr>
+        <w:t xml:space="preserve">any offers of settlement which were made so that </w:t>
+      </w:r>
+      <w:r>
+        <w:rPr>
+          <w:rFonts w:ascii="Times New Roman" w:hAnsi="Times New Roman" w:cs="Times New Roman"/>
+          <w:highlight w:val="yellow"/>
         </w:rPr>
         <w:t>HE_SHE_CLIENT</w:t>
       </w:r>
@@ -4959,7 +6102,25 @@
         <w:rPr>
           <w:rFonts w:ascii="Times New Roman" w:hAnsi="Times New Roman" w:cs="Times New Roman"/>
         </w:rPr>
-        <w:t xml:space="preserve"> might take proper steps to protect his own interest.” </w:t>
+        <w:t xml:space="preserve"> might take</w:t>
+      </w:r>
+      <w:r>
+        <w:rPr>
+          <w:rFonts w:ascii="Times New Roman" w:hAnsi="Times New Roman" w:cs="Times New Roman"/>
+        </w:rPr>
+        <w:t xml:space="preserve"> </w:t>
+      </w:r>
+      <w:r>
+        <w:rPr>
+          <w:rFonts w:ascii="Times New Roman" w:hAnsi="Times New Roman" w:cs="Times New Roman"/>
+        </w:rPr>
+        <w:t>proper steps to protect his own interest.</w:t>
+      </w:r>
+      <w:r>
+        <w:rPr>
+          <w:rFonts w:ascii="Times New Roman" w:hAnsi="Times New Roman" w:cs="Times New Roman"/>
+        </w:rPr>
+        <w:t xml:space="preserve">” </w:t>
       </w:r>
     </w:p>
     <w:p>
@@ -4999,71 +6160,79 @@
           <w:i/>
           <w:iCs/>
         </w:rPr>
-        <w:t>Martin v. Hartford Acc. &amp; Indem. Co.</w:t>
-      </w:r>
-      <w:r>
-        <w:rPr>
-          <w:rFonts w:ascii="Times New Roman" w:hAnsi="Times New Roman" w:cs="Times New Roman"/>
-        </w:rPr>
-        <w:t xml:space="preserve"> (1964 228 Cal. App. 2d 178, 184; </w:t>
-      </w:r>
+        <w:t xml:space="preserve">Martin v. Hartford Acc. &amp; </w:t>
+      </w:r>
+      <w:proofErr w:type="spellStart"/>
       <w:r>
         <w:rPr>
           <w:rFonts w:ascii="Times New Roman" w:hAnsi="Times New Roman" w:cs="Times New Roman"/>
           <w:i/>
           <w:iCs/>
         </w:rPr>
-        <w:t>see also,</w:t>
-      </w:r>
-      <w:r>
-        <w:rPr>
-          <w:rFonts w:ascii="Times New Roman" w:hAnsi="Times New Roman" w:cs="Times New Roman"/>
-        </w:rPr>
-        <w:t xml:space="preserve"> </w:t>
-      </w:r>
+        <w:t>Indem</w:t>
+      </w:r>
+      <w:proofErr w:type="spellEnd"/>
       <w:r>
         <w:rPr>
           <w:rFonts w:ascii="Times New Roman" w:hAnsi="Times New Roman" w:cs="Times New Roman"/>
           <w:i/>
           <w:iCs/>
         </w:rPr>
-        <w:t>Betts v. Allstate Ins. Co.</w:t>
-      </w:r>
-      <w:r>
-        <w:rPr>
-          <w:rFonts w:ascii="Times New Roman" w:hAnsi="Times New Roman" w:cs="Times New Roman"/>
-        </w:rPr>
-        <w:t xml:space="preserve"> (1984) 154 Cal. App. 3d 688, 703. </w:t>
-      </w:r>
-    </w:p>
-    <w:p>
-      <w:pPr>
-        <w:tabs>
-          <w:tab w:val="left" w:pos="540"/>
-        </w:tabs>
-        <w:ind w:left="547"/>
-        <w:jc w:val="both"/>
-        <w:rPr>
-          <w:rFonts w:ascii="Times New Roman" w:hAnsi="Times New Roman" w:cs="Times New Roman"/>
-        </w:rPr>
-      </w:pPr>
-    </w:p>
-    <w:p>
-      <w:pPr>
-        <w:tabs>
-          <w:tab w:val="left" w:pos="540"/>
-        </w:tabs>
-        <w:ind w:left="547"/>
-        <w:jc w:val="both"/>
-        <w:rPr>
-          <w:rFonts w:ascii="Times New Roman" w:hAnsi="Times New Roman" w:cs="Times New Roman"/>
-        </w:rPr>
-      </w:pPr>
-      <w:r>
-        <w:rPr>
-          <w:rFonts w:ascii="Times New Roman" w:hAnsi="Times New Roman" w:cs="Times New Roman"/>
-        </w:rPr>
-        <w:t xml:space="preserve">This duty to communicate the offer has been deemed particularly important when it is a demand within the policy limits. </w:t>
+        <w:t>. Co.</w:t>
+      </w:r>
+      <w:r>
+        <w:rPr>
+          <w:rFonts w:ascii="Times New Roman" w:hAnsi="Times New Roman" w:cs="Times New Roman"/>
+        </w:rPr>
+        <w:t xml:space="preserve"> (196</w:t>
+      </w:r>
+      <w:r>
+        <w:rPr>
+          <w:rFonts w:ascii="Times New Roman" w:hAnsi="Times New Roman" w:cs="Times New Roman"/>
+        </w:rPr>
+        <w:t>4</w:t>
+      </w:r>
+      <w:r>
+        <w:rPr>
+          <w:rFonts w:ascii="Times New Roman" w:hAnsi="Times New Roman" w:cs="Times New Roman"/>
+        </w:rPr>
+        <w:t xml:space="preserve"> 228 Cal.</w:t>
+      </w:r>
+      <w:r>
+        <w:rPr>
+          <w:rFonts w:ascii="Times New Roman" w:hAnsi="Times New Roman" w:cs="Times New Roman"/>
+        </w:rPr>
+        <w:t xml:space="preserve"> </w:t>
+      </w:r>
+      <w:r>
+        <w:rPr>
+          <w:rFonts w:ascii="Times New Roman" w:hAnsi="Times New Roman" w:cs="Times New Roman"/>
+        </w:rPr>
+        <w:t>App.</w:t>
+      </w:r>
+      <w:r>
+        <w:rPr>
+          <w:rFonts w:ascii="Times New Roman" w:hAnsi="Times New Roman" w:cs="Times New Roman"/>
+        </w:rPr>
+        <w:t xml:space="preserve"> </w:t>
+      </w:r>
+      <w:r>
+        <w:rPr>
+          <w:rFonts w:ascii="Times New Roman" w:hAnsi="Times New Roman" w:cs="Times New Roman"/>
+        </w:rPr>
+        <w:t>2d 178, 184</w:t>
+      </w:r>
+      <w:r>
+        <w:rPr>
+          <w:rFonts w:ascii="Times New Roman" w:hAnsi="Times New Roman" w:cs="Times New Roman"/>
+        </w:rPr>
+        <w:t>;</w:t>
+      </w:r>
+      <w:r>
+        <w:rPr>
+          <w:rFonts w:ascii="Times New Roman" w:hAnsi="Times New Roman" w:cs="Times New Roman"/>
+        </w:rPr>
+        <w:t xml:space="preserve"> </w:t>
       </w:r>
       <w:r>
         <w:rPr>
@@ -5071,67 +6240,7 @@
           <w:i/>
           <w:iCs/>
         </w:rPr>
-        <w:t>Anguiano v. Allstate Ins, Co</w:t>
-      </w:r>
-      <w:r>
-        <w:rPr>
-          <w:rFonts w:ascii="Times New Roman" w:hAnsi="Times New Roman" w:cs="Times New Roman"/>
-        </w:rPr>
-        <w:t xml:space="preserve">. 209 F. 3d at 1 169. Additionally, “The insured who is kept informed may have further information to give to the carrier; </w:t>
-      </w:r>
-      <w:r>
-        <w:rPr>
-          <w:rFonts w:ascii="Times New Roman" w:hAnsi="Times New Roman" w:cs="Times New Roman"/>
-        </w:rPr>
-        <w:t xml:space="preserve">HE_SHE_CLIENT </w:t>
-      </w:r>
-      <w:r>
-        <w:rPr>
-          <w:rFonts w:ascii="Times New Roman" w:hAnsi="Times New Roman" w:cs="Times New Roman"/>
-        </w:rPr>
-        <w:t xml:space="preserve">may use powers of persuasion upon the carrier to increase its offer; </w:t>
-      </w:r>
-      <w:r>
-        <w:rPr>
-          <w:rFonts w:ascii="Times New Roman" w:hAnsi="Times New Roman" w:cs="Times New Roman"/>
-        </w:rPr>
-        <w:t>HE_SHE_CLIENT</w:t>
-      </w:r>
-      <w:r>
-        <w:rPr>
-          <w:rFonts w:ascii="Times New Roman" w:hAnsi="Times New Roman" w:cs="Times New Roman"/>
-        </w:rPr>
-        <w:t xml:space="preserve"> </w:t>
-      </w:r>
-      <w:r>
-        <w:rPr>
-          <w:rFonts w:ascii="Times New Roman" w:hAnsi="Times New Roman" w:cs="Times New Roman"/>
-        </w:rPr>
-        <w:t xml:space="preserve">may engage counsel; </w:t>
-      </w:r>
-      <w:r>
-        <w:rPr>
-          <w:rFonts w:ascii="Times New Roman" w:hAnsi="Times New Roman" w:cs="Times New Roman"/>
-        </w:rPr>
-        <w:t xml:space="preserve">HE_SHE_CLIENT </w:t>
-      </w:r>
-      <w:r>
-        <w:rPr>
-          <w:rFonts w:ascii="Times New Roman" w:hAnsi="Times New Roman" w:cs="Times New Roman"/>
-        </w:rPr>
-        <w:t xml:space="preserve">may have other courses of action open to </w:t>
-      </w:r>
-      <w:r>
-        <w:rPr>
-          <w:rFonts w:ascii="Times New Roman" w:hAnsi="Times New Roman" w:cs="Times New Roman"/>
-        </w:rPr>
-        <w:t>HER_HIM_CLIENT</w:t>
-      </w:r>
-      <w:r>
-        <w:rPr>
-          <w:rFonts w:ascii="Times New Roman" w:hAnsi="Times New Roman" w:cs="Times New Roman"/>
-        </w:rPr>
-        <w:t xml:space="preserve">.” </w:t>
+        <w:t>see also</w:t>
       </w:r>
       <w:r>
         <w:rPr>
@@ -5139,13 +6248,13 @@
           <w:i/>
           <w:iCs/>
         </w:rPr>
-        <w:t>Martin v. Hartford Acc. &amp; Indem. Co.,</w:t>
-      </w:r>
-      <w:r>
-        <w:rPr>
-          <w:rFonts w:ascii="Times New Roman" w:hAnsi="Times New Roman" w:cs="Times New Roman"/>
-        </w:rPr>
-        <w:t xml:space="preserve"> 228 Cal .App. 2d at 184. Moreover, insurers have a duty to communicate all demands in excess of policy limits. </w:t>
+        <w:t>,</w:t>
+      </w:r>
+      <w:r>
+        <w:rPr>
+          <w:rFonts w:ascii="Times New Roman" w:hAnsi="Times New Roman" w:cs="Times New Roman"/>
+        </w:rPr>
+        <w:t xml:space="preserve"> </w:t>
       </w:r>
       <w:r>
         <w:rPr>
@@ -5153,13 +6262,381 @@
           <w:i/>
           <w:iCs/>
         </w:rPr>
+        <w:t>Betts v. Allstate</w:t>
+      </w:r>
+      <w:r>
+        <w:rPr>
+          <w:rFonts w:ascii="Times New Roman" w:hAnsi="Times New Roman" w:cs="Times New Roman"/>
+          <w:i/>
+          <w:iCs/>
+        </w:rPr>
+        <w:t xml:space="preserve"> </w:t>
+      </w:r>
+      <w:r>
+        <w:rPr>
+          <w:rFonts w:ascii="Times New Roman" w:hAnsi="Times New Roman" w:cs="Times New Roman"/>
+          <w:i/>
+          <w:iCs/>
+        </w:rPr>
+        <w:t>Ins. Co.</w:t>
+      </w:r>
+      <w:r>
+        <w:rPr>
+          <w:rFonts w:ascii="Times New Roman" w:hAnsi="Times New Roman" w:cs="Times New Roman"/>
+        </w:rPr>
+        <w:t xml:space="preserve"> (1984) 154 Cal.</w:t>
+      </w:r>
+      <w:r>
+        <w:rPr>
+          <w:rFonts w:ascii="Times New Roman" w:hAnsi="Times New Roman" w:cs="Times New Roman"/>
+        </w:rPr>
+        <w:t xml:space="preserve"> </w:t>
+      </w:r>
+      <w:r>
+        <w:rPr>
+          <w:rFonts w:ascii="Times New Roman" w:hAnsi="Times New Roman" w:cs="Times New Roman"/>
+        </w:rPr>
+        <w:t>App.</w:t>
+      </w:r>
+      <w:r>
+        <w:rPr>
+          <w:rFonts w:ascii="Times New Roman" w:hAnsi="Times New Roman" w:cs="Times New Roman"/>
+        </w:rPr>
+        <w:t xml:space="preserve"> </w:t>
+      </w:r>
+      <w:r>
+        <w:rPr>
+          <w:rFonts w:ascii="Times New Roman" w:hAnsi="Times New Roman" w:cs="Times New Roman"/>
+        </w:rPr>
+        <w:t>3d 688, 703.</w:t>
+      </w:r>
+      <w:r>
+        <w:rPr>
+          <w:rFonts w:ascii="Times New Roman" w:hAnsi="Times New Roman" w:cs="Times New Roman"/>
+        </w:rPr>
+        <w:t xml:space="preserve"> </w:t>
+      </w:r>
+    </w:p>
+    <w:p>
+      <w:pPr>
+        <w:tabs>
+          <w:tab w:val="left" w:pos="540"/>
+        </w:tabs>
+        <w:ind w:left="547"/>
+        <w:jc w:val="both"/>
+        <w:rPr>
+          <w:rFonts w:ascii="Times New Roman" w:hAnsi="Times New Roman" w:cs="Times New Roman"/>
+        </w:rPr>
+      </w:pPr>
+    </w:p>
+    <w:p>
+      <w:pPr>
+        <w:tabs>
+          <w:tab w:val="left" w:pos="540"/>
+        </w:tabs>
+        <w:ind w:left="547"/>
+        <w:jc w:val="both"/>
+        <w:rPr>
+          <w:rFonts w:ascii="Times New Roman" w:hAnsi="Times New Roman" w:cs="Times New Roman"/>
+        </w:rPr>
+      </w:pPr>
+      <w:r>
+        <w:rPr>
+          <w:rFonts w:ascii="Times New Roman" w:hAnsi="Times New Roman" w:cs="Times New Roman"/>
+        </w:rPr>
+        <w:t>This duty to communicate the offer has been deemed particularly important when it is a</w:t>
+      </w:r>
+      <w:r>
+        <w:rPr>
+          <w:rFonts w:ascii="Times New Roman" w:hAnsi="Times New Roman" w:cs="Times New Roman"/>
+        </w:rPr>
+        <w:t xml:space="preserve"> </w:t>
+      </w:r>
+      <w:r>
+        <w:rPr>
+          <w:rFonts w:ascii="Times New Roman" w:hAnsi="Times New Roman" w:cs="Times New Roman"/>
+        </w:rPr>
+        <w:t xml:space="preserve">demand within the policy limits. </w:t>
+      </w:r>
+      <w:r>
+        <w:rPr>
+          <w:rFonts w:ascii="Times New Roman" w:hAnsi="Times New Roman" w:cs="Times New Roman"/>
+          <w:i/>
+          <w:iCs/>
+        </w:rPr>
+        <w:t>Anguiano v. Allstate Ins, Co</w:t>
+      </w:r>
+      <w:r>
+        <w:rPr>
+          <w:rFonts w:ascii="Times New Roman" w:hAnsi="Times New Roman" w:cs="Times New Roman"/>
+        </w:rPr>
+        <w:t>.</w:t>
+      </w:r>
+      <w:r>
+        <w:rPr>
+          <w:rFonts w:ascii="Times New Roman" w:hAnsi="Times New Roman" w:cs="Times New Roman"/>
+        </w:rPr>
+        <w:t xml:space="preserve"> </w:t>
+      </w:r>
+      <w:r>
+        <w:rPr>
+          <w:rFonts w:ascii="Times New Roman" w:hAnsi="Times New Roman" w:cs="Times New Roman"/>
+        </w:rPr>
+        <w:t>209 F.</w:t>
+      </w:r>
+      <w:r>
+        <w:rPr>
+          <w:rFonts w:ascii="Times New Roman" w:hAnsi="Times New Roman" w:cs="Times New Roman"/>
+        </w:rPr>
+        <w:t xml:space="preserve"> </w:t>
+      </w:r>
+      <w:r>
+        <w:rPr>
+          <w:rFonts w:ascii="Times New Roman" w:hAnsi="Times New Roman" w:cs="Times New Roman"/>
+        </w:rPr>
+        <w:t>3d at 1 169.</w:t>
+      </w:r>
+      <w:r>
+        <w:rPr>
+          <w:rFonts w:ascii="Times New Roman" w:hAnsi="Times New Roman" w:cs="Times New Roman"/>
+        </w:rPr>
+        <w:t xml:space="preserve"> Additionally, “</w:t>
+      </w:r>
+      <w:r>
+        <w:rPr>
+          <w:rFonts w:ascii="Times New Roman" w:hAnsi="Times New Roman" w:cs="Times New Roman"/>
+        </w:rPr>
+        <w:t>The insured who is kep</w:t>
+      </w:r>
+      <w:r>
+        <w:rPr>
+          <w:rFonts w:ascii="Times New Roman" w:hAnsi="Times New Roman" w:cs="Times New Roman"/>
+        </w:rPr>
+        <w:t xml:space="preserve">t </w:t>
+      </w:r>
+      <w:r>
+        <w:rPr>
+          <w:rFonts w:ascii="Times New Roman" w:hAnsi="Times New Roman" w:cs="Times New Roman"/>
+        </w:rPr>
+        <w:t>informed may have further information</w:t>
+      </w:r>
+      <w:r>
+        <w:rPr>
+          <w:rFonts w:ascii="Times New Roman" w:hAnsi="Times New Roman" w:cs="Times New Roman"/>
+        </w:rPr>
+        <w:t xml:space="preserve"> </w:t>
+      </w:r>
+      <w:r>
+        <w:rPr>
+          <w:rFonts w:ascii="Times New Roman" w:hAnsi="Times New Roman" w:cs="Times New Roman"/>
+        </w:rPr>
+        <w:t xml:space="preserve">to give to the carrier; </w:t>
+      </w:r>
+      <w:r>
+        <w:rPr>
+          <w:rFonts w:ascii="Times New Roman" w:hAnsi="Times New Roman" w:cs="Times New Roman"/>
+          <w:highlight w:val="yellow"/>
+        </w:rPr>
+        <w:t>HE_SHE_CLIENT</w:t>
+      </w:r>
+      <w:r>
+        <w:rPr>
+          <w:rFonts w:ascii="Times New Roman" w:hAnsi="Times New Roman" w:cs="Times New Roman"/>
+        </w:rPr>
+        <w:t xml:space="preserve"> </w:t>
+      </w:r>
+      <w:r>
+        <w:rPr>
+          <w:rFonts w:ascii="Times New Roman" w:hAnsi="Times New Roman" w:cs="Times New Roman"/>
+        </w:rPr>
+        <w:t>may use powers of persuasion upon the</w:t>
+      </w:r>
+      <w:r>
+        <w:rPr>
+          <w:rFonts w:ascii="Times New Roman" w:hAnsi="Times New Roman" w:cs="Times New Roman"/>
+        </w:rPr>
+        <w:t xml:space="preserve"> </w:t>
+      </w:r>
+      <w:r>
+        <w:rPr>
+          <w:rFonts w:ascii="Times New Roman" w:hAnsi="Times New Roman" w:cs="Times New Roman"/>
+        </w:rPr>
+        <w:t xml:space="preserve">carrier to increase its offer; </w:t>
+      </w:r>
+      <w:r>
+        <w:rPr>
+          <w:rFonts w:ascii="Times New Roman" w:hAnsi="Times New Roman" w:cs="Times New Roman"/>
+          <w:highlight w:val="yellow"/>
+        </w:rPr>
+        <w:t>HE_SHE_CLIENT</w:t>
+      </w:r>
+      <w:r>
+        <w:rPr>
+          <w:rFonts w:ascii="Times New Roman" w:hAnsi="Times New Roman" w:cs="Times New Roman"/>
+        </w:rPr>
+        <w:t xml:space="preserve"> </w:t>
+      </w:r>
+      <w:r>
+        <w:rPr>
+          <w:rFonts w:ascii="Times New Roman" w:hAnsi="Times New Roman" w:cs="Times New Roman"/>
+        </w:rPr>
+        <w:t xml:space="preserve">may engage counsel; </w:t>
+      </w:r>
+      <w:r>
+        <w:rPr>
+          <w:rFonts w:ascii="Times New Roman" w:hAnsi="Times New Roman" w:cs="Times New Roman"/>
+          <w:highlight w:val="yellow"/>
+        </w:rPr>
+        <w:t>HE_SHE_CLIENT</w:t>
+      </w:r>
+      <w:r>
+        <w:rPr>
+          <w:rFonts w:ascii="Times New Roman" w:hAnsi="Times New Roman" w:cs="Times New Roman"/>
+        </w:rPr>
+        <w:t xml:space="preserve"> </w:t>
+      </w:r>
+      <w:r>
+        <w:rPr>
+          <w:rFonts w:ascii="Times New Roman" w:hAnsi="Times New Roman" w:cs="Times New Roman"/>
+        </w:rPr>
+        <w:t>may have</w:t>
+      </w:r>
+      <w:r>
+        <w:rPr>
+          <w:rFonts w:ascii="Times New Roman" w:hAnsi="Times New Roman" w:cs="Times New Roman"/>
+        </w:rPr>
+        <w:t xml:space="preserve"> </w:t>
+      </w:r>
+      <w:r>
+        <w:rPr>
+          <w:rFonts w:ascii="Times New Roman" w:hAnsi="Times New Roman" w:cs="Times New Roman"/>
+        </w:rPr>
+        <w:t xml:space="preserve">other courses of action open to </w:t>
+      </w:r>
+      <w:r>
+        <w:rPr>
+          <w:rFonts w:ascii="Times New Roman" w:hAnsi="Times New Roman" w:cs="Times New Roman"/>
+          <w:highlight w:val="yellow"/>
+        </w:rPr>
+        <w:t>HER_HIM_CLIENT</w:t>
+      </w:r>
+      <w:r>
+        <w:rPr>
+          <w:rFonts w:ascii="Times New Roman" w:hAnsi="Times New Roman" w:cs="Times New Roman"/>
+        </w:rPr>
+        <w:t>.</w:t>
+      </w:r>
+      <w:r>
+        <w:rPr>
+          <w:rFonts w:ascii="Times New Roman" w:hAnsi="Times New Roman" w:cs="Times New Roman"/>
+        </w:rPr>
+        <w:t xml:space="preserve">” </w:t>
+      </w:r>
+      <w:r>
+        <w:rPr>
+          <w:rFonts w:ascii="Times New Roman" w:hAnsi="Times New Roman" w:cs="Times New Roman"/>
+          <w:i/>
+          <w:iCs/>
+        </w:rPr>
+        <w:t xml:space="preserve">Martin v. Hartford Acc. &amp; </w:t>
+      </w:r>
+      <w:proofErr w:type="spellStart"/>
+      <w:r>
+        <w:rPr>
+          <w:rFonts w:ascii="Times New Roman" w:hAnsi="Times New Roman" w:cs="Times New Roman"/>
+          <w:i/>
+          <w:iCs/>
+        </w:rPr>
+        <w:t>Indem</w:t>
+      </w:r>
+      <w:proofErr w:type="spellEnd"/>
+      <w:r>
+        <w:rPr>
+          <w:rFonts w:ascii="Times New Roman" w:hAnsi="Times New Roman" w:cs="Times New Roman"/>
+          <w:i/>
+          <w:iCs/>
+        </w:rPr>
+        <w:t>. Co.,</w:t>
+      </w:r>
+      <w:r>
+        <w:rPr>
+          <w:rFonts w:ascii="Times New Roman" w:hAnsi="Times New Roman" w:cs="Times New Roman"/>
+        </w:rPr>
+        <w:t xml:space="preserve"> 228 Cal</w:t>
+      </w:r>
+      <w:r>
+        <w:rPr>
+          <w:rFonts w:ascii="Times New Roman" w:hAnsi="Times New Roman" w:cs="Times New Roman"/>
+        </w:rPr>
+        <w:t xml:space="preserve"> </w:t>
+      </w:r>
+      <w:r>
+        <w:rPr>
+          <w:rFonts w:ascii="Times New Roman" w:hAnsi="Times New Roman" w:cs="Times New Roman"/>
+        </w:rPr>
+        <w:t>.App.</w:t>
+      </w:r>
+      <w:r>
+        <w:rPr>
+          <w:rFonts w:ascii="Times New Roman" w:hAnsi="Times New Roman" w:cs="Times New Roman"/>
+        </w:rPr>
+        <w:t xml:space="preserve"> </w:t>
+      </w:r>
+      <w:r>
+        <w:rPr>
+          <w:rFonts w:ascii="Times New Roman" w:hAnsi="Times New Roman" w:cs="Times New Roman"/>
+        </w:rPr>
+        <w:t>2d at 184. Moreover, i</w:t>
+      </w:r>
+      <w:r>
+        <w:rPr>
+          <w:rFonts w:ascii="Times New Roman" w:hAnsi="Times New Roman" w:cs="Times New Roman"/>
+        </w:rPr>
+        <w:t>nsurers have a duty to communicate all demands in excess of policy limits.</w:t>
+      </w:r>
+      <w:r>
+        <w:rPr>
+          <w:rFonts w:ascii="Times New Roman" w:hAnsi="Times New Roman" w:cs="Times New Roman"/>
+        </w:rPr>
+        <w:t xml:space="preserve"> </w:t>
+      </w:r>
+      <w:r>
+        <w:rPr>
+          <w:rFonts w:ascii="Times New Roman" w:hAnsi="Times New Roman" w:cs="Times New Roman"/>
+          <w:i/>
+          <w:iCs/>
+        </w:rPr>
         <w:t>Merritt v. Reserve Ins. Co,</w:t>
       </w:r>
       <w:r>
         <w:rPr>
           <w:rFonts w:ascii="Times New Roman" w:hAnsi="Times New Roman" w:cs="Times New Roman"/>
         </w:rPr>
-        <w:t xml:space="preserve"> (1913) 34 Cal. App. 3d 858, 875.</w:t>
+        <w:t xml:space="preserve"> (1913) 34 Cal.</w:t>
+      </w:r>
+      <w:r>
+        <w:rPr>
+          <w:rFonts w:ascii="Times New Roman" w:hAnsi="Times New Roman" w:cs="Times New Roman"/>
+        </w:rPr>
+        <w:t xml:space="preserve"> </w:t>
+      </w:r>
+      <w:r>
+        <w:rPr>
+          <w:rFonts w:ascii="Times New Roman" w:hAnsi="Times New Roman" w:cs="Times New Roman"/>
+        </w:rPr>
+        <w:t>App.</w:t>
+      </w:r>
+      <w:r>
+        <w:rPr>
+          <w:rFonts w:ascii="Times New Roman" w:hAnsi="Times New Roman" w:cs="Times New Roman"/>
+        </w:rPr>
+        <w:t xml:space="preserve"> </w:t>
+      </w:r>
+      <w:r>
+        <w:rPr>
+          <w:rFonts w:ascii="Times New Roman" w:hAnsi="Times New Roman" w:cs="Times New Roman"/>
+        </w:rPr>
+        <w:t>3d 858, 875.</w:t>
       </w:r>
     </w:p>
     <w:p>
@@ -5189,11 +6666,108 @@
         <w:rPr>
           <w:rFonts w:ascii="Times New Roman" w:hAnsi="Times New Roman" w:cs="Times New Roman"/>
         </w:rPr>
-        <w:t xml:space="preserve">It is insufficient for you to merely inform your insureds of the sum of the demand. You must actually communicate the full content of this offer to ensure: (1) Your insureds are familiar with the nature of their exposure; (2) Your insureds can fairly evaluate whether or not they wish to offer personal assets, if necessary, to ensure that the fully policy limits are paid on the off-chance that </w:t>
-      </w:r>
-      <w:r>
-        <w:rPr>
-          <w:rFonts w:ascii="Times New Roman" w:hAnsi="Times New Roman" w:cs="Times New Roman"/>
+        <w:t xml:space="preserve">It is insufficient for you to merely inform your </w:t>
+      </w:r>
+      <w:r>
+        <w:rPr>
+          <w:rFonts w:ascii="Times New Roman" w:hAnsi="Times New Roman" w:cs="Times New Roman"/>
+        </w:rPr>
+        <w:t xml:space="preserve">insureds </w:t>
+      </w:r>
+      <w:r>
+        <w:rPr>
+          <w:rFonts w:ascii="Times New Roman" w:hAnsi="Times New Roman" w:cs="Times New Roman"/>
+        </w:rPr>
+        <w:t xml:space="preserve">of the sum of the demand. </w:t>
+      </w:r>
+      <w:r>
+        <w:rPr>
+          <w:rFonts w:ascii="Times New Roman" w:hAnsi="Times New Roman" w:cs="Times New Roman"/>
+        </w:rPr>
+        <w:t>Y</w:t>
+      </w:r>
+      <w:r>
+        <w:rPr>
+          <w:rFonts w:ascii="Times New Roman" w:hAnsi="Times New Roman" w:cs="Times New Roman"/>
+        </w:rPr>
+        <w:t>ou</w:t>
+      </w:r>
+      <w:r>
+        <w:rPr>
+          <w:rFonts w:ascii="Times New Roman" w:hAnsi="Times New Roman" w:cs="Times New Roman"/>
+        </w:rPr>
+        <w:t xml:space="preserve"> </w:t>
+      </w:r>
+      <w:r>
+        <w:rPr>
+          <w:rFonts w:ascii="Times New Roman" w:hAnsi="Times New Roman" w:cs="Times New Roman"/>
+        </w:rPr>
+        <w:t>must actually communicate the full content of this offer to ensure:</w:t>
+      </w:r>
+      <w:r>
+        <w:rPr>
+          <w:rFonts w:ascii="Times New Roman" w:hAnsi="Times New Roman" w:cs="Times New Roman"/>
+        </w:rPr>
+        <w:t xml:space="preserve"> (</w:t>
+      </w:r>
+      <w:r>
+        <w:rPr>
+          <w:rFonts w:ascii="Times New Roman" w:hAnsi="Times New Roman" w:cs="Times New Roman"/>
+        </w:rPr>
+        <w:t>1</w:t>
+      </w:r>
+      <w:r>
+        <w:rPr>
+          <w:rFonts w:ascii="Times New Roman" w:hAnsi="Times New Roman" w:cs="Times New Roman"/>
+        </w:rPr>
+        <w:t xml:space="preserve">) </w:t>
+      </w:r>
+      <w:r>
+        <w:rPr>
+          <w:rFonts w:ascii="Times New Roman" w:hAnsi="Times New Roman" w:cs="Times New Roman"/>
+        </w:rPr>
+        <w:t>Your insureds are familiar with the nature of their exposure;</w:t>
+      </w:r>
+      <w:r>
+        <w:rPr>
+          <w:rFonts w:ascii="Times New Roman" w:hAnsi="Times New Roman" w:cs="Times New Roman"/>
+        </w:rPr>
+        <w:t xml:space="preserve"> (2) </w:t>
+      </w:r>
+      <w:r>
+        <w:rPr>
+          <w:rFonts w:ascii="Times New Roman" w:hAnsi="Times New Roman" w:cs="Times New Roman"/>
+        </w:rPr>
+        <w:t>Your insureds can fairly evaluate whether or not they wish to offer personal</w:t>
+      </w:r>
+      <w:r>
+        <w:rPr>
+          <w:rFonts w:ascii="Times New Roman" w:hAnsi="Times New Roman" w:cs="Times New Roman"/>
+        </w:rPr>
+        <w:t xml:space="preserve"> </w:t>
+      </w:r>
+      <w:r>
+        <w:rPr>
+          <w:rFonts w:ascii="Times New Roman" w:hAnsi="Times New Roman" w:cs="Times New Roman"/>
+        </w:rPr>
+        <w:t xml:space="preserve">assets, if necessary, to ensure that the fully policy limits are paid on the </w:t>
+      </w:r>
+      <w:r>
+        <w:rPr>
+          <w:rFonts w:ascii="Times New Roman" w:hAnsi="Times New Roman" w:cs="Times New Roman"/>
+        </w:rPr>
+        <w:t>off-chance</w:t>
+      </w:r>
+      <w:r>
+        <w:rPr>
+          <w:rFonts w:ascii="Times New Roman" w:hAnsi="Times New Roman" w:cs="Times New Roman"/>
+        </w:rPr>
+        <w:t xml:space="preserve"> that </w:t>
+      </w:r>
+      <w:r>
+        <w:rPr>
+          <w:rFonts w:ascii="Times New Roman" w:hAnsi="Times New Roman" w:cs="Times New Roman"/>
+          <w:highlight w:val="yellow"/>
         </w:rPr>
         <w:t>INSURANCE_INIT</w:t>
       </w:r>
@@ -5207,11 +6781,36 @@
         <w:rPr>
           <w:rFonts w:ascii="Times New Roman" w:hAnsi="Times New Roman" w:cs="Times New Roman"/>
         </w:rPr>
-        <w:t xml:space="preserve">fails to tender its policy limits; and (3) Your insureds can evaluate whether they wish to retain private counsel (as they should) to communicate to </w:t>
+        <w:t>fails to tender its policy limits; an</w:t>
+      </w:r>
+      <w:r>
+        <w:rPr>
+          <w:rFonts w:ascii="Times New Roman" w:hAnsi="Times New Roman" w:cs="Times New Roman"/>
+        </w:rPr>
+        <w:t xml:space="preserve">d (3) </w:t>
+      </w:r>
+      <w:r>
+        <w:rPr>
+          <w:rFonts w:ascii="Times New Roman" w:hAnsi="Times New Roman" w:cs="Times New Roman"/>
+        </w:rPr>
+        <w:t>Your insureds can evaluate whether they wish to retain private counsel (as they</w:t>
+      </w:r>
+      <w:r>
+        <w:rPr>
+          <w:rFonts w:ascii="Times New Roman" w:hAnsi="Times New Roman" w:cs="Times New Roman"/>
+        </w:rPr>
+        <w:t xml:space="preserve"> </w:t>
+      </w:r>
+      <w:r>
+        <w:rPr>
+          <w:rFonts w:ascii="Times New Roman" w:hAnsi="Times New Roman" w:cs="Times New Roman"/>
+        </w:rPr>
+        <w:t xml:space="preserve">should) to communicate to </w:t>
       </w:r>
       <w:r>
         <w:rPr>
           <w:rFonts w:ascii="Times New Roman" w:eastAsia="Times New Roman" w:hAnsi="Times New Roman" w:cs="Times New Roman"/>
+          <w:highlight w:val="yellow"/>
         </w:rPr>
         <w:t>INSURANCE_NAME</w:t>
       </w:r>
@@ -5225,7 +6824,19 @@
         <w:rPr>
           <w:rFonts w:ascii="Times New Roman" w:hAnsi="Times New Roman" w:cs="Times New Roman"/>
         </w:rPr>
-        <w:t xml:space="preserve"> the importance of tendering its policy limits so that their personal assets are not exposed to an excess judgment.</w:t>
+        <w:t xml:space="preserve"> the importance of tendering its policy limits so that their</w:t>
+      </w:r>
+      <w:r>
+        <w:rPr>
+          <w:rFonts w:ascii="Times New Roman" w:hAnsi="Times New Roman" w:cs="Times New Roman"/>
+        </w:rPr>
+        <w:t xml:space="preserve"> </w:t>
+      </w:r>
+      <w:r>
+        <w:rPr>
+          <w:rFonts w:ascii="Times New Roman" w:hAnsi="Times New Roman" w:cs="Times New Roman"/>
+        </w:rPr>
+        <w:t>personal assets are not exposed to an excess judgment.</w:t>
       </w:r>
     </w:p>
     <w:p>
@@ -5261,16 +6872,16 @@
           <w:b/>
           <w:bCs/>
         </w:rPr>
-        <w:t xml:space="preserve">Therefore, request is separately hereby made to immediately direct and forward copies of this herein Time Sensitive Policy Limit Settlement Demand Offer, and all accompanying exhibits and </w:t>
+        <w:t xml:space="preserve">Therefore, request is separately hereby made to immediately direct and forward copies of this herein Time Sensitive Policy Limit Settlement Demand Offer, and all accompanying exhibits and documents, to the attention of: (1) Any and all </w:t>
       </w:r>
       <w:r>
         <w:rPr>
           <w:rFonts w:ascii="Times New Roman" w:hAnsi="Times New Roman" w:cs="Times New Roman"/>
           <w:b/>
           <w:bCs/>
-        </w:rPr>
-        <w:lastRenderedPageBreak/>
-        <w:t xml:space="preserve">documents, to the attention of: (1) Any and all </w:t>
+          <w:highlight w:val="yellow"/>
+        </w:rPr>
+        <w:t>INSURANCE_NAME</w:t>
       </w:r>
       <w:r>
         <w:rPr>
@@ -5278,6 +6889,84 @@
           <w:b/>
           <w:bCs/>
         </w:rPr>
+        <w:t xml:space="preserve"> </w:t>
+      </w:r>
+      <w:r>
+        <w:rPr>
+          <w:rFonts w:ascii="Times New Roman" w:hAnsi="Times New Roman" w:cs="Times New Roman"/>
+          <w:b/>
+          <w:bCs/>
+        </w:rPr>
+        <w:t>decision</w:t>
+      </w:r>
+      <w:r>
+        <w:rPr>
+          <w:rFonts w:ascii="Times New Roman" w:hAnsi="Times New Roman" w:cs="Times New Roman"/>
+          <w:b/>
+          <w:bCs/>
+        </w:rPr>
+        <w:t xml:space="preserve"> makers; and (2) Your insured, </w:t>
+      </w:r>
+      <w:r>
+        <w:rPr>
+          <w:rFonts w:ascii="Times New Roman" w:hAnsi="Times New Roman" w:cs="Times New Roman"/>
+          <w:b/>
+          <w:bCs/>
+          <w:highlight w:val="yellow"/>
+        </w:rPr>
+        <w:t>MR_MRS_INSURED_NAME_EACH_CAP</w:t>
+      </w:r>
+      <w:r>
+        <w:rPr>
+          <w:rFonts w:ascii="Times New Roman" w:hAnsi="Times New Roman" w:cs="Times New Roman"/>
+          <w:b/>
+          <w:bCs/>
+        </w:rPr>
+        <w:t xml:space="preserve">; and (3) Your insured’s private counsel and/or attorneys. </w:t>
+      </w:r>
+    </w:p>
+    <w:p>
+      <w:pPr>
+        <w:tabs>
+          <w:tab w:val="left" w:pos="540"/>
+        </w:tabs>
+        <w:ind w:left="547"/>
+        <w:jc w:val="both"/>
+        <w:rPr>
+          <w:rFonts w:ascii="Times New Roman" w:hAnsi="Times New Roman" w:cs="Times New Roman"/>
+          <w:b/>
+          <w:bCs/>
+        </w:rPr>
+      </w:pPr>
+    </w:p>
+    <w:p>
+      <w:pPr>
+        <w:tabs>
+          <w:tab w:val="left" w:pos="540"/>
+        </w:tabs>
+        <w:ind w:left="547"/>
+        <w:jc w:val="both"/>
+        <w:rPr>
+          <w:rFonts w:ascii="Times New Roman" w:hAnsi="Times New Roman" w:cs="Times New Roman"/>
+          <w:b/>
+          <w:bCs/>
+        </w:rPr>
+      </w:pPr>
+      <w:r>
+        <w:rPr>
+          <w:rFonts w:ascii="Times New Roman" w:hAnsi="Times New Roman" w:cs="Times New Roman"/>
+          <w:b/>
+          <w:bCs/>
+        </w:rPr>
+        <w:t xml:space="preserve">Additionally, a further separate request is hereby made that </w:t>
+      </w:r>
+      <w:r>
+        <w:rPr>
+          <w:rFonts w:ascii="Times New Roman" w:hAnsi="Times New Roman" w:cs="Times New Roman"/>
+          <w:b/>
+          <w:bCs/>
+          <w:highlight w:val="yellow"/>
+        </w:rPr>
         <w:t>INSURANCE_NAME</w:t>
       </w:r>
       <w:r>
@@ -5286,7 +6975,7 @@
           <w:b/>
           <w:bCs/>
         </w:rPr>
-        <w:t xml:space="preserve"> decision makers; and (2) Your insured, </w:t>
+        <w:t xml:space="preserve"> </w:t>
       </w:r>
       <w:r>
         <w:rPr>
@@ -5294,7 +6983,7 @@
           <w:b/>
           <w:bCs/>
         </w:rPr>
-        <w:t>MR_MRS_INSURED_NAME_EACH_CAP</w:t>
+        <w:t>provide</w:t>
       </w:r>
       <w:r>
         <w:rPr>
@@ -5302,59 +6991,7 @@
           <w:b/>
           <w:bCs/>
         </w:rPr>
-        <w:t xml:space="preserve">; and (3) Your insured’s private counsel and/or attorneys. </w:t>
-      </w:r>
-    </w:p>
-    <w:p>
-      <w:pPr>
-        <w:tabs>
-          <w:tab w:val="left" w:pos="540"/>
-        </w:tabs>
-        <w:ind w:left="547"/>
-        <w:jc w:val="both"/>
-        <w:rPr>
-          <w:rFonts w:ascii="Times New Roman" w:hAnsi="Times New Roman" w:cs="Times New Roman"/>
-          <w:b/>
-          <w:bCs/>
-        </w:rPr>
-      </w:pPr>
-    </w:p>
-    <w:p>
-      <w:pPr>
-        <w:tabs>
-          <w:tab w:val="left" w:pos="540"/>
-        </w:tabs>
-        <w:ind w:left="547"/>
-        <w:jc w:val="both"/>
-        <w:rPr>
-          <w:rFonts w:ascii="Times New Roman" w:hAnsi="Times New Roman" w:cs="Times New Roman"/>
-          <w:b/>
-          <w:bCs/>
-        </w:rPr>
-      </w:pPr>
-      <w:r>
-        <w:rPr>
-          <w:rFonts w:ascii="Times New Roman" w:hAnsi="Times New Roman" w:cs="Times New Roman"/>
-          <w:b/>
-          <w:bCs/>
-        </w:rPr>
-        <w:t xml:space="preserve">Additionally, a further separate request is hereby made that </w:t>
-      </w:r>
-      <w:r>
-        <w:rPr>
-          <w:rFonts w:ascii="Times New Roman" w:hAnsi="Times New Roman" w:cs="Times New Roman"/>
-          <w:b/>
-          <w:bCs/>
-        </w:rPr>
-        <w:t>INSURANCE_NAME</w:t>
-      </w:r>
-      <w:r>
-        <w:rPr>
-          <w:rFonts w:ascii="Times New Roman" w:hAnsi="Times New Roman" w:cs="Times New Roman"/>
-          <w:b/>
-          <w:bCs/>
-        </w:rPr>
-        <w:t xml:space="preserve"> provide this office with the contact information for your insured’s private counsel or attorneys.  </w:t>
+        <w:t xml:space="preserve"> this office with the contact information for your insured’s private counsel or attorneys.  </w:t>
       </w:r>
     </w:p>
     <w:p>
@@ -5392,7 +7029,7 @@
           <w:bCs/>
           <w:u w:val="single"/>
         </w:rPr>
-        <w:t xml:space="preserve">THIS IS AN OFFER FOR A COMPLETE RELEASE FROM OUR </w:t>
+        <w:t>THIS IS AN OFFER FOR A COMPLETE RELEASE FROM OUR</w:t>
       </w:r>
       <w:r>
         <w:rPr>
@@ -5401,6 +7038,16 @@
           <w:bCs/>
           <w:u w:val="single"/>
         </w:rPr>
+        <w:t xml:space="preserve"> </w:t>
+      </w:r>
+      <w:r>
+        <w:rPr>
+          <w:rFonts w:ascii="Times New Roman" w:hAnsi="Times New Roman" w:cs="Times New Roman"/>
+          <w:b/>
+          <w:bCs/>
+          <w:highlight w:val="yellow"/>
+          <w:u w:val="single"/>
+        </w:rPr>
         <w:t>CLIENT_NAME_ALL_CAP</w:t>
       </w:r>
       <w:r>
@@ -5488,12 +7135,18 @@
         <w:rPr>
           <w:rFonts w:ascii="Times New Roman" w:eastAsia="Times New Roman" w:hAnsi="Times New Roman" w:cs="Times New Roman"/>
         </w:rPr>
-        <w:t xml:space="preserve"> all the foregoing evidence, expecting that we will simply “go away,” this will not happen. The undersigned attorney has no problem with pursuing cases all the way through jury trial, for as long as it takes to achieve full, fair, and just recovery for h</w:t>
+        <w:t xml:space="preserve"> all the foregoing evidence, expecting that we will simply “go away,” this will not happen. The undersigned attorney has no problem with pursuing cases all the way through jury trial, for as long as it takes to achieve full, fair, and just recovery for </w:t>
       </w:r>
       <w:r>
         <w:rPr>
           <w:rFonts w:ascii="Times New Roman" w:eastAsia="Times New Roman" w:hAnsi="Times New Roman" w:cs="Times New Roman"/>
         </w:rPr>
+        <w:t>h</w:t>
+      </w:r>
+      <w:r>
+        <w:rPr>
+          <w:rFonts w:ascii="Times New Roman" w:eastAsia="Times New Roman" w:hAnsi="Times New Roman" w:cs="Times New Roman"/>
+        </w:rPr>
         <w:t>er</w:t>
       </w:r>
       <w:r>
@@ -5530,12 +7183,18 @@
         <w:rPr>
           <w:rFonts w:ascii="Times New Roman" w:eastAsia="Times New Roman" w:hAnsi="Times New Roman" w:cs="Times New Roman"/>
         </w:rPr>
-        <w:t>Plainly put, the undersigned has no intention of going away for an insulting settlement amount, and still believes the title of “attorney” means something: being willing to fight through the entire process to get the result to which h</w:t>
+        <w:t xml:space="preserve">Plainly put, the undersigned has no intention of going away for an insulting settlement amount, and still believes the title of “attorney” means something: being willing to fight through the entire process to get the result to which </w:t>
       </w:r>
       <w:r>
         <w:rPr>
           <w:rFonts w:ascii="Times New Roman" w:eastAsia="Times New Roman" w:hAnsi="Times New Roman" w:cs="Times New Roman"/>
         </w:rPr>
+        <w:t>h</w:t>
+      </w:r>
+      <w:r>
+        <w:rPr>
+          <w:rFonts w:ascii="Times New Roman" w:eastAsia="Times New Roman" w:hAnsi="Times New Roman" w:cs="Times New Roman"/>
+        </w:rPr>
         <w:t>er</w:t>
       </w:r>
       <w:r>
@@ -5674,18 +7333,33 @@
       <w:r>
         <w:rPr>
           <w:rFonts w:ascii="Times New Roman" w:hAnsi="Times New Roman" w:cs="Times New Roman"/>
+          <w:highlight w:val="yellow"/>
         </w:rPr>
         <w:t>INSURANCE_NAME</w:t>
       </w:r>
       <w:r>
         <w:rPr>
           <w:rFonts w:ascii="Times New Roman" w:hAnsi="Times New Roman" w:cs="Times New Roman"/>
-        </w:rPr>
-        <w:t xml:space="preserve">’s potential exposure from this loss in a prospective bad faith action against </w:t>
-      </w:r>
-      <w:r>
-        <w:rPr>
-          <w:rFonts w:ascii="Times New Roman" w:hAnsi="Times New Roman" w:cs="Times New Roman"/>
+          <w:highlight w:val="yellow"/>
+        </w:rPr>
+        <w:t>’s</w:t>
+      </w:r>
+      <w:r>
+        <w:rPr>
+          <w:rFonts w:ascii="Times New Roman" w:hAnsi="Times New Roman" w:cs="Times New Roman"/>
+        </w:rPr>
+        <w:t xml:space="preserve"> </w:t>
+      </w:r>
+      <w:r>
+        <w:rPr>
+          <w:rFonts w:ascii="Times New Roman" w:hAnsi="Times New Roman" w:cs="Times New Roman"/>
+        </w:rPr>
+        <w:t xml:space="preserve">potential exposure from this loss in a prospective bad faith action against </w:t>
+      </w:r>
+      <w:r>
+        <w:rPr>
+          <w:rFonts w:ascii="Times New Roman" w:hAnsi="Times New Roman" w:cs="Times New Roman"/>
+          <w:highlight w:val="yellow"/>
         </w:rPr>
         <w:t>INSURANCE_NAME</w:t>
       </w:r>
@@ -5693,7 +7367,13 @@
         <w:rPr>
           <w:rFonts w:ascii="Times New Roman" w:hAnsi="Times New Roman" w:cs="Times New Roman"/>
         </w:rPr>
-        <w:t>, if necessary.</w:t>
+        <w:t>,</w:t>
+      </w:r>
+      <w:r>
+        <w:rPr>
+          <w:rFonts w:ascii="Times New Roman" w:hAnsi="Times New Roman" w:cs="Times New Roman"/>
+        </w:rPr>
+        <w:t xml:space="preserve"> if necessary.</w:t>
       </w:r>
     </w:p>
     <w:p>
@@ -5722,235 +7402,236 @@
         <w:rPr>
           <w:rFonts w:ascii="Times New Roman" w:hAnsi="Times New Roman" w:cs="Times New Roman"/>
         </w:rPr>
+        <w:t xml:space="preserve">In the spirit of cooperation and in further attempts to resolve these issues informally and amicably, please feel free contact the undersigned upon receipt of this letter so that we may discuss the issues contained herein on or before the expiration of this settlement demand. </w:t>
+      </w:r>
+    </w:p>
+    <w:p>
+      <w:pPr>
+        <w:tabs>
+          <w:tab w:val="left" w:pos="540"/>
+        </w:tabs>
+        <w:ind w:left="547"/>
+        <w:jc w:val="both"/>
+        <w:rPr>
+          <w:rFonts w:ascii="Times New Roman" w:hAnsi="Times New Roman" w:cs="Times New Roman"/>
+        </w:rPr>
+      </w:pPr>
+    </w:p>
+    <w:p>
+      <w:pPr>
+        <w:tabs>
+          <w:tab w:val="left" w:pos="540"/>
+        </w:tabs>
+        <w:ind w:left="547"/>
+        <w:jc w:val="both"/>
+        <w:rPr>
+          <w:rFonts w:ascii="Times New Roman" w:hAnsi="Times New Roman" w:cs="Times New Roman"/>
+        </w:rPr>
+      </w:pPr>
+      <w:r>
+        <w:rPr>
+          <w:rFonts w:ascii="Times New Roman" w:hAnsi="Times New Roman" w:cs="Times New Roman"/>
+        </w:rPr>
+        <w:t xml:space="preserve">Nevertheless, please be advised that our demand to settle the above referenced claim will expire after </w:t>
+      </w:r>
+      <w:r>
+        <w:rPr>
+          <w:rFonts w:ascii="Times New Roman" w:hAnsi="Times New Roman" w:cs="Times New Roman"/>
+          <w:b/>
+          <w:u w:val="single"/>
+        </w:rPr>
+        <w:t xml:space="preserve">5:00 P.M. ON </w:t>
+      </w:r>
+      <w:r>
+        <w:rPr>
+          <w:rFonts w:ascii="Times New Roman" w:hAnsi="Times New Roman" w:cs="Times New Roman"/>
+          <w:b/>
+          <w:highlight w:val="yellow"/>
+          <w:u w:val="single"/>
+        </w:rPr>
+        <w:t>SETTLEMENT_EXP_DATE</w:t>
+      </w:r>
+      <w:r>
+        <w:rPr>
+          <w:rFonts w:ascii="Times New Roman" w:hAnsi="Times New Roman" w:cs="Times New Roman"/>
+        </w:rPr>
+        <w:t>.</w:t>
+      </w:r>
+    </w:p>
+    <w:p>
+      <w:pPr>
+        <w:tabs>
+          <w:tab w:val="left" w:pos="540"/>
+        </w:tabs>
+        <w:jc w:val="both"/>
+        <w:rPr>
+          <w:rFonts w:ascii="Times New Roman" w:hAnsi="Times New Roman" w:cs="Times New Roman"/>
+          <w:b/>
+        </w:rPr>
+      </w:pPr>
+    </w:p>
+    <w:p>
+      <w:pPr>
+        <w:tabs>
+          <w:tab w:val="left" w:pos="540"/>
+        </w:tabs>
+        <w:ind w:left="547"/>
+        <w:jc w:val="both"/>
+        <w:rPr>
+          <w:rFonts w:ascii="Times New Roman" w:hAnsi="Times New Roman" w:cs="Times New Roman"/>
+        </w:rPr>
+      </w:pPr>
+      <w:r>
+        <w:rPr>
+          <w:rFonts w:ascii="Times New Roman" w:hAnsi="Times New Roman" w:cs="Times New Roman"/>
+        </w:rPr>
+        <w:t xml:space="preserve">Thank you for your anticipated courtesy and cooperation in this regard. </w:t>
+      </w:r>
+    </w:p>
+    <w:p>
+      <w:pPr>
+        <w:tabs>
+          <w:tab w:val="left" w:pos="540"/>
+        </w:tabs>
+        <w:jc w:val="both"/>
+        <w:rPr>
+          <w:rFonts w:ascii="Times New Roman" w:hAnsi="Times New Roman" w:cs="Times New Roman"/>
+        </w:rPr>
+      </w:pPr>
+    </w:p>
+    <w:p>
+      <w:pPr>
+        <w:tabs>
+          <w:tab w:val="left" w:pos="540"/>
+        </w:tabs>
+        <w:ind w:left="547"/>
+        <w:jc w:val="both"/>
+        <w:rPr>
+          <w:rFonts w:ascii="Times New Roman" w:hAnsi="Times New Roman" w:cs="Times New Roman"/>
+        </w:rPr>
+      </w:pPr>
+      <w:r>
+        <w:rPr>
+          <w:rFonts w:ascii="Times New Roman" w:hAnsi="Times New Roman" w:cs="Times New Roman"/>
+        </w:rPr>
+        <w:t xml:space="preserve">I look forward to receiving your response without delay. </w:t>
+      </w:r>
+      <w:r>
+        <w:rPr>
+          <w:rFonts w:ascii="Times New Roman" w:hAnsi="Times New Roman" w:cs="Times New Roman"/>
+        </w:rPr>
+        <w:tab/>
+      </w:r>
+      <w:r>
+        <w:rPr>
+          <w:rFonts w:ascii="Times New Roman" w:hAnsi="Times New Roman" w:cs="Times New Roman"/>
+        </w:rPr>
+        <w:tab/>
+      </w:r>
+    </w:p>
+    <w:p>
+      <w:pPr>
+        <w:tabs>
+          <w:tab w:val="left" w:pos="540"/>
+        </w:tabs>
+        <w:ind w:left="547"/>
+        <w:jc w:val="both"/>
+        <w:rPr>
+          <w:rFonts w:ascii="Times New Roman" w:hAnsi="Times New Roman" w:cs="Times New Roman"/>
+        </w:rPr>
+      </w:pPr>
+    </w:p>
+    <w:p>
+      <w:pPr>
+        <w:tabs>
+          <w:tab w:val="left" w:pos="540"/>
+        </w:tabs>
+        <w:ind w:left="547"/>
+        <w:jc w:val="both"/>
+        <w:rPr>
+          <w:rFonts w:ascii="Times New Roman" w:hAnsi="Times New Roman" w:cs="Times New Roman"/>
+        </w:rPr>
+      </w:pPr>
+    </w:p>
+    <w:p>
+      <w:pPr>
+        <w:tabs>
+          <w:tab w:val="left" w:pos="540"/>
+        </w:tabs>
+        <w:jc w:val="both"/>
+        <w:rPr>
+          <w:rFonts w:ascii="Times New Roman" w:eastAsia="Calibri" w:hAnsi="Times New Roman" w:cs="Times New Roman"/>
+        </w:rPr>
+      </w:pPr>
+    </w:p>
+    <w:p>
+      <w:pPr>
+        <w:tabs>
+          <w:tab w:val="left" w:pos="540"/>
+        </w:tabs>
+        <w:ind w:left="1440"/>
+        <w:rPr>
+          <w:rFonts w:ascii="Times New Roman" w:hAnsi="Times New Roman"/>
+        </w:rPr>
+      </w:pPr>
+      <w:r>
+        <w:rPr>
+          <w:rFonts w:ascii="Times New Roman" w:eastAsia="Calibri" w:hAnsi="Times New Roman" w:cs="Times New Roman"/>
+        </w:rPr>
+        <w:tab/>
+      </w:r>
+      <w:r>
+        <w:rPr>
+          <w:rFonts w:ascii="Times New Roman" w:eastAsia="Calibri" w:hAnsi="Times New Roman" w:cs="Times New Roman"/>
+        </w:rPr>
+        <w:tab/>
+      </w:r>
+      <w:r>
+        <w:rPr>
+          <w:rFonts w:ascii="Times New Roman" w:eastAsia="Calibri" w:hAnsi="Times New Roman" w:cs="Times New Roman"/>
+        </w:rPr>
+        <w:tab/>
+      </w:r>
+      <w:r>
+        <w:rPr>
+          <w:rFonts w:ascii="Times New Roman" w:eastAsia="Calibri" w:hAnsi="Times New Roman" w:cs="Times New Roman"/>
+        </w:rPr>
+        <w:tab/>
+      </w:r>
+      <w:r>
+        <w:rPr>
+          <w:rFonts w:ascii="Times New Roman" w:eastAsia="Calibri" w:hAnsi="Times New Roman" w:cs="Times New Roman"/>
+        </w:rPr>
+        <w:tab/>
+      </w:r>
+      <w:r>
+        <w:rPr>
+          <w:rFonts w:ascii="Times New Roman" w:eastAsia="Calibri" w:hAnsi="Times New Roman" w:cs="Times New Roman"/>
+        </w:rPr>
+        <w:tab/>
+      </w:r>
+      <w:r>
+        <w:rPr>
+          <w:rFonts w:ascii="Times New Roman" w:hAnsi="Times New Roman"/>
+        </w:rPr>
+        <w:t>Very Truly Yours,</w:t>
+      </w:r>
+    </w:p>
+    <w:p>
+      <w:pPr>
+        <w:tabs>
+          <w:tab w:val="left" w:pos="540"/>
+        </w:tabs>
+        <w:ind w:left="5040"/>
+        <w:rPr>
+          <w:rFonts w:ascii="Times New Roman" w:hAnsi="Times New Roman"/>
+        </w:rPr>
+      </w:pPr>
+      <w:r>
+        <w:rPr>
+          <w:rFonts w:ascii="Times New Roman" w:hAnsi="Times New Roman"/>
+        </w:rPr>
         <w:lastRenderedPageBreak/>
-        <w:t xml:space="preserve">In the spirit of cooperation and in further attempts to resolve these issues informally and amicably, please feel free contact the undersigned upon receipt of this letter so that we may discuss the issues contained herein on or before the expiration of this settlement demand. </w:t>
-      </w:r>
-    </w:p>
-    <w:p>
-      <w:pPr>
-        <w:tabs>
-          <w:tab w:val="left" w:pos="540"/>
-        </w:tabs>
-        <w:ind w:left="547"/>
-        <w:jc w:val="both"/>
-        <w:rPr>
-          <w:rFonts w:ascii="Times New Roman" w:hAnsi="Times New Roman" w:cs="Times New Roman"/>
-        </w:rPr>
-      </w:pPr>
-    </w:p>
-    <w:p>
-      <w:pPr>
-        <w:tabs>
-          <w:tab w:val="left" w:pos="540"/>
-        </w:tabs>
-        <w:ind w:left="547"/>
-        <w:jc w:val="both"/>
-        <w:rPr>
-          <w:rFonts w:ascii="Times New Roman" w:hAnsi="Times New Roman" w:cs="Times New Roman"/>
-        </w:rPr>
-      </w:pPr>
-      <w:r>
-        <w:rPr>
-          <w:rFonts w:ascii="Times New Roman" w:hAnsi="Times New Roman" w:cs="Times New Roman"/>
-        </w:rPr>
-        <w:t xml:space="preserve">Nevertheless, please be advised that our demand to settle the above referenced claim will expire after </w:t>
-      </w:r>
-      <w:r>
-        <w:rPr>
-          <w:rFonts w:ascii="Times New Roman" w:hAnsi="Times New Roman" w:cs="Times New Roman"/>
-          <w:b/>
-          <w:u w:val="single"/>
-        </w:rPr>
-        <w:t xml:space="preserve">5:00 P.M. ON </w:t>
-      </w:r>
-      <w:r>
-        <w:rPr>
-          <w:rFonts w:ascii="Times New Roman" w:hAnsi="Times New Roman" w:cs="Times New Roman"/>
-          <w:b/>
-          <w:u w:val="single"/>
-        </w:rPr>
-        <w:t>SETTLEMENT_EXP_DATE</w:t>
-      </w:r>
-      <w:r>
-        <w:rPr>
-          <w:rFonts w:ascii="Times New Roman" w:hAnsi="Times New Roman" w:cs="Times New Roman"/>
-        </w:rPr>
-        <w:t>.</w:t>
-      </w:r>
-    </w:p>
-    <w:p>
-      <w:pPr>
-        <w:tabs>
-          <w:tab w:val="left" w:pos="540"/>
-        </w:tabs>
-        <w:jc w:val="both"/>
-        <w:rPr>
-          <w:rFonts w:ascii="Times New Roman" w:hAnsi="Times New Roman" w:cs="Times New Roman"/>
-          <w:b/>
-        </w:rPr>
-      </w:pPr>
-    </w:p>
-    <w:p>
-      <w:pPr>
-        <w:tabs>
-          <w:tab w:val="left" w:pos="540"/>
-        </w:tabs>
-        <w:ind w:left="547"/>
-        <w:jc w:val="both"/>
-        <w:rPr>
-          <w:rFonts w:ascii="Times New Roman" w:hAnsi="Times New Roman" w:cs="Times New Roman"/>
-        </w:rPr>
-      </w:pPr>
-      <w:r>
-        <w:rPr>
-          <w:rFonts w:ascii="Times New Roman" w:hAnsi="Times New Roman" w:cs="Times New Roman"/>
-        </w:rPr>
-        <w:t xml:space="preserve">Thank you for your anticipated courtesy and cooperation in this regard. </w:t>
-      </w:r>
-    </w:p>
-    <w:p>
-      <w:pPr>
-        <w:tabs>
-          <w:tab w:val="left" w:pos="540"/>
-        </w:tabs>
-        <w:jc w:val="both"/>
-        <w:rPr>
-          <w:rFonts w:ascii="Times New Roman" w:hAnsi="Times New Roman" w:cs="Times New Roman"/>
-        </w:rPr>
-      </w:pPr>
-    </w:p>
-    <w:p>
-      <w:pPr>
-        <w:tabs>
-          <w:tab w:val="left" w:pos="540"/>
-        </w:tabs>
-        <w:ind w:left="547"/>
-        <w:jc w:val="both"/>
-        <w:rPr>
-          <w:rFonts w:ascii="Times New Roman" w:hAnsi="Times New Roman" w:cs="Times New Roman"/>
-        </w:rPr>
-      </w:pPr>
-      <w:r>
-        <w:rPr>
-          <w:rFonts w:ascii="Times New Roman" w:hAnsi="Times New Roman" w:cs="Times New Roman"/>
-        </w:rPr>
-        <w:t xml:space="preserve">I look forward to receiving your response without delay. </w:t>
-      </w:r>
-      <w:r>
-        <w:rPr>
-          <w:rFonts w:ascii="Times New Roman" w:hAnsi="Times New Roman" w:cs="Times New Roman"/>
-        </w:rPr>
-        <w:tab/>
-      </w:r>
-      <w:r>
-        <w:rPr>
-          <w:rFonts w:ascii="Times New Roman" w:hAnsi="Times New Roman" w:cs="Times New Roman"/>
-        </w:rPr>
-        <w:tab/>
-      </w:r>
-    </w:p>
-    <w:p>
-      <w:pPr>
-        <w:tabs>
-          <w:tab w:val="left" w:pos="540"/>
-        </w:tabs>
-        <w:ind w:left="547"/>
-        <w:jc w:val="both"/>
-        <w:rPr>
-          <w:rFonts w:ascii="Times New Roman" w:hAnsi="Times New Roman" w:cs="Times New Roman"/>
-        </w:rPr>
-      </w:pPr>
-    </w:p>
-    <w:p>
-      <w:pPr>
-        <w:tabs>
-          <w:tab w:val="left" w:pos="540"/>
-        </w:tabs>
-        <w:ind w:left="547"/>
-        <w:jc w:val="both"/>
-        <w:rPr>
-          <w:rFonts w:ascii="Times New Roman" w:hAnsi="Times New Roman" w:cs="Times New Roman"/>
-        </w:rPr>
-      </w:pPr>
-    </w:p>
-    <w:p>
-      <w:pPr>
-        <w:tabs>
-          <w:tab w:val="left" w:pos="540"/>
-        </w:tabs>
-        <w:jc w:val="both"/>
-        <w:rPr>
-          <w:rFonts w:ascii="Times New Roman" w:eastAsia="Calibri" w:hAnsi="Times New Roman" w:cs="Times New Roman"/>
-        </w:rPr>
-      </w:pPr>
-    </w:p>
-    <w:p>
-      <w:pPr>
-        <w:tabs>
-          <w:tab w:val="left" w:pos="540"/>
-        </w:tabs>
-        <w:ind w:left="1440"/>
-        <w:rPr>
-          <w:rFonts w:ascii="Times New Roman" w:hAnsi="Times New Roman"/>
-        </w:rPr>
-      </w:pPr>
-      <w:r>
-        <w:rPr>
-          <w:rFonts w:ascii="Times New Roman" w:eastAsia="Calibri" w:hAnsi="Times New Roman" w:cs="Times New Roman"/>
-        </w:rPr>
-        <w:tab/>
-      </w:r>
-      <w:r>
-        <w:rPr>
-          <w:rFonts w:ascii="Times New Roman" w:eastAsia="Calibri" w:hAnsi="Times New Roman" w:cs="Times New Roman"/>
-        </w:rPr>
-        <w:tab/>
-      </w:r>
-      <w:r>
-        <w:rPr>
-          <w:rFonts w:ascii="Times New Roman" w:eastAsia="Calibri" w:hAnsi="Times New Roman" w:cs="Times New Roman"/>
-        </w:rPr>
-        <w:tab/>
-      </w:r>
-      <w:r>
-        <w:rPr>
-          <w:rFonts w:ascii="Times New Roman" w:eastAsia="Calibri" w:hAnsi="Times New Roman" w:cs="Times New Roman"/>
-        </w:rPr>
-        <w:tab/>
-      </w:r>
-      <w:r>
-        <w:rPr>
-          <w:rFonts w:ascii="Times New Roman" w:eastAsia="Calibri" w:hAnsi="Times New Roman" w:cs="Times New Roman"/>
-        </w:rPr>
-        <w:tab/>
-      </w:r>
-      <w:r>
-        <w:rPr>
-          <w:rFonts w:ascii="Times New Roman" w:eastAsia="Calibri" w:hAnsi="Times New Roman" w:cs="Times New Roman"/>
-        </w:rPr>
-        <w:tab/>
-      </w:r>
-      <w:r>
-        <w:rPr>
-          <w:rFonts w:ascii="Times New Roman" w:hAnsi="Times New Roman"/>
-        </w:rPr>
-        <w:t>Very Truly Yours,</w:t>
-      </w:r>
-    </w:p>
-    <w:p>
-      <w:pPr>
-        <w:tabs>
-          <w:tab w:val="left" w:pos="540"/>
-        </w:tabs>
-        <w:ind w:left="5040"/>
-        <w:rPr>
-          <w:rFonts w:ascii="Times New Roman" w:hAnsi="Times New Roman"/>
-        </w:rPr>
-      </w:pPr>
-      <w:r>
-        <w:rPr>
-          <w:rFonts w:ascii="Times New Roman" w:hAnsi="Times New Roman"/>
-        </w:rPr>
         <w:tab/>
       </w:r>
       <w:r>
@@ -6131,6 +7812,7 @@
           <w:szCs w:val="16"/>
         </w:rPr>
       </w:pPr>
+      <w:proofErr w:type="gramStart"/>
       <w:r>
         <w:rPr>
           <w:rFonts w:ascii="Times New Roman" w:hAnsi="Times New Roman"/>
@@ -6147,6 +7829,7 @@
         </w:rPr>
         <w:t>./</w:t>
       </w:r>
+      <w:proofErr w:type="gramEnd"/>
       <w:r>
         <w:rPr>
           <w:rFonts w:ascii="Times New Roman" w:hAnsi="Times New Roman"/>
@@ -6446,14 +8129,24 @@
         <w:sz w:val="20"/>
         <w:szCs w:val="20"/>
       </w:rPr>
-      <w:t>Our Client</w:t>
+      <w:t xml:space="preserve">Our </w:t>
     </w:r>
+    <w:proofErr w:type="gramStart"/>
     <w:r>
       <w:rPr>
         <w:i/>
         <w:sz w:val="20"/>
         <w:szCs w:val="20"/>
       </w:rPr>
+      <w:t>Client</w:t>
+    </w:r>
+    <w:proofErr w:type="gramEnd"/>
+    <w:r>
+      <w:rPr>
+        <w:i/>
+        <w:sz w:val="20"/>
+        <w:szCs w:val="20"/>
+      </w:rPr>
       <w:t xml:space="preserve">: </w:t>
     </w:r>
     <w:r>
@@ -6461,6 +8154,7 @@
         <w:i/>
         <w:sz w:val="20"/>
         <w:szCs w:val="20"/>
+        <w:highlight w:val="yellow"/>
       </w:rPr>
       <w:t>CLIENT_NAME_EACH_CAP</w:t>
     </w:r>
@@ -6488,6 +8182,7 @@
         <w:i/>
         <w:sz w:val="20"/>
         <w:szCs w:val="20"/>
+        <w:highlight w:val="yellow"/>
       </w:rPr>
       <w:t>INSURED_NAME_EACH_CAP</w:t>
     </w:r>
@@ -6518,6 +8213,7 @@
         <w:i/>
         <w:sz w:val="20"/>
         <w:szCs w:val="20"/>
+        <w:highlight w:val="yellow"/>
       </w:rPr>
       <w:t>CLAIM_NUMBER</w:t>
     </w:r>
@@ -6544,6 +8240,7 @@
         <w:i/>
         <w:sz w:val="20"/>
         <w:szCs w:val="20"/>
+        <w:highlight w:val="yellow"/>
       </w:rPr>
       <w:t>DATE_OF_LOSS</w:t>
     </w:r>
@@ -6885,6 +8582,7 @@
               <w:lang w:val="fr-FR"/>
             </w:rPr>
           </w:pPr>
+          <w:proofErr w:type="gramStart"/>
           <w:r>
             <w:rPr>
               <w:rFonts w:ascii="Adobe Garamond Pro" w:hAnsi="Adobe Garamond Pro" w:cs="Arial"/>
@@ -6895,7 +8593,20 @@
               <w:szCs w:val="16"/>
               <w:lang w:val="fr-FR"/>
             </w:rPr>
-            <w:t xml:space="preserve">T: </w:t>
+            <w:t>T:</w:t>
+          </w:r>
+          <w:proofErr w:type="gramEnd"/>
+          <w:r>
+            <w:rPr>
+              <w:rFonts w:ascii="Adobe Garamond Pro" w:hAnsi="Adobe Garamond Pro" w:cs="Arial"/>
+              <w:b/>
+              <w:bCs/>
+              <w:color w:val="000000" w:themeColor="text1"/>
+              <w:sz w:val="16"/>
+              <w:szCs w:val="16"/>
+              <w:lang w:val="fr-FR"/>
+            </w:rPr>
+            <w:t xml:space="preserve"> </w:t>
           </w:r>
           <w:r>
             <w:rPr>
@@ -6935,6 +8646,7 @@
               <w:lang w:val="fr-FR"/>
             </w:rPr>
           </w:pPr>
+          <w:proofErr w:type="gramStart"/>
           <w:r>
             <w:rPr>
               <w:rFonts w:ascii="Adobe Garamond Pro" w:hAnsi="Adobe Garamond Pro" w:cs="Arial"/>
@@ -6945,7 +8657,20 @@
               <w:szCs w:val="16"/>
               <w:lang w:val="fr-FR"/>
             </w:rPr>
-            <w:t>F: 424. 429.2432</w:t>
+            <w:t>F:</w:t>
+          </w:r>
+          <w:proofErr w:type="gramEnd"/>
+          <w:r>
+            <w:rPr>
+              <w:rFonts w:ascii="Adobe Garamond Pro" w:hAnsi="Adobe Garamond Pro" w:cs="Arial"/>
+              <w:b/>
+              <w:bCs/>
+              <w:color w:val="000000" w:themeColor="text1"/>
+              <w:sz w:val="16"/>
+              <w:szCs w:val="16"/>
+              <w:lang w:val="fr-FR"/>
+            </w:rPr>
+            <w:t xml:space="preserve"> 424. 429.2432</w:t>
           </w:r>
         </w:p>
         <w:p>
@@ -6961,6 +8686,7 @@
               <w:lang w:val="fr-FR"/>
             </w:rPr>
           </w:pPr>
+          <w:proofErr w:type="gramStart"/>
           <w:r>
             <w:rPr>
               <w:rFonts w:ascii="Adobe Garamond Pro" w:hAnsi="Adobe Garamond Pro" w:cs="Arial"/>
@@ -6971,7 +8697,20 @@
               <w:szCs w:val="16"/>
               <w:lang w:val="fr-FR"/>
             </w:rPr>
-            <w:t>Email: Lillian@Sedlawgroup.com</w:t>
+            <w:t>Email:</w:t>
+          </w:r>
+          <w:proofErr w:type="gramEnd"/>
+          <w:r>
+            <w:rPr>
+              <w:rFonts w:ascii="Adobe Garamond Pro" w:hAnsi="Adobe Garamond Pro" w:cs="Arial"/>
+              <w:b/>
+              <w:bCs/>
+              <w:color w:val="000000" w:themeColor="text1"/>
+              <w:sz w:val="16"/>
+              <w:szCs w:val="16"/>
+              <w:lang w:val="fr-FR"/>
+            </w:rPr>
+            <w:t xml:space="preserve"> Lillian@Sedlawgroup.com</w:t>
           </w:r>
         </w:p>
         <w:p>
@@ -10706,7 +12445,6 @@
   <w:style w:type="character" w:default="1" w:styleId="DefaultParagraphFont">
     <w:name w:val="Default Paragraph Font"/>
     <w:uiPriority w:val="1"/>
-    <w:semiHidden/>
     <w:unhideWhenUsed/>
   </w:style>
   <w:style w:type="table" w:default="1" w:styleId="TableNormal">

</xml_diff>